<commit_message>
Modificacion de archivos segun correciones marcadas
</commit_message>
<xml_diff>
--- a/01 Documentación/Scrum/EcoWaste Plan de Pruebas.docx
+++ b/01 Documentación/Scrum/EcoWaste Plan de Pruebas.docx
@@ -3688,17 +3688,7 @@
                 <w:i w:val="0"/>
                 <w:iCs w:val="0"/>
               </w:rPr>
-              <w:t>1</w:t>
-            </w:r>
-            <w:r>
-              <w:rPr>
-                <w:rFonts w:cs="Times New Roman"/>
-                <w:b/>
-                <w:bCs/>
-                <w:i w:val="0"/>
-                <w:iCs w:val="0"/>
-              </w:rPr>
-              <w:t>4</w:t>
+              <w:t>14</w:t>
             </w:r>
           </w:p>
         </w:tc>
@@ -5704,6 +5694,80 @@
               <w:t>Tener una cuenta activa</w:t>
             </w:r>
           </w:p>
+          <w:p>
+            <w:pPr>
+              <w:pStyle w:val="TableContents"/>
+              <w:numPr>
+                <w:ilvl w:val="0"/>
+                <w:numId w:val="2"/>
+              </w:numPr>
+              <w:rPr>
+                <w:color w:val="000000"/>
+              </w:rPr>
+            </w:pPr>
+            <w:r>
+              <w:rPr>
+                <w:color w:val="000000"/>
+              </w:rPr>
+              <w:t xml:space="preserve">Encontrase </w:t>
+            </w:r>
+            <w:proofErr w:type="spellStart"/>
+            <w:r>
+              <w:rPr>
+                <w:color w:val="000000"/>
+              </w:rPr>
+              <w:t>logueado</w:t>
+            </w:r>
+            <w:proofErr w:type="spellEnd"/>
+            <w:r>
+              <w:rPr>
+                <w:color w:val="000000"/>
+              </w:rPr>
+              <w:t xml:space="preserve"> como Empresa</w:t>
+            </w:r>
+          </w:p>
+          <w:p>
+            <w:pPr>
+              <w:pStyle w:val="TableContents"/>
+              <w:numPr>
+                <w:ilvl w:val="0"/>
+                <w:numId w:val="2"/>
+              </w:numPr>
+              <w:rPr>
+                <w:color w:val="000000"/>
+              </w:rPr>
+            </w:pPr>
+            <w:r>
+              <w:rPr>
+                <w:color w:val="000000"/>
+              </w:rPr>
+              <w:t xml:space="preserve">Encontrase en la opción Publicación &gt; </w:t>
+            </w:r>
+            <w:r>
+              <w:rPr>
+                <w:color w:val="000000"/>
+              </w:rPr>
+              <w:t>Nueva Publicación</w:t>
+            </w:r>
+          </w:p>
+          <w:p>
+            <w:pPr>
+              <w:pStyle w:val="TableContents"/>
+              <w:numPr>
+                <w:ilvl w:val="0"/>
+                <w:numId w:val="2"/>
+              </w:numPr>
+              <w:rPr>
+                <w:color w:val="000000"/>
+              </w:rPr>
+            </w:pPr>
+            <w:r>
+              <w:rPr>
+                <w:color w:val="000000"/>
+              </w:rPr>
+              <w:t>Encontrarse en la interfaz de crear publicación</w:t>
+            </w:r>
+          </w:p>
         </w:tc>
       </w:tr>
       <w:tr>
@@ -5918,26 +5982,11 @@
                 <w:ilvl w:val="0"/>
                 <w:numId w:val="2"/>
               </w:numPr>
-            </w:pPr>
-            <w:r>
-              <w:t>El sistema mostro un mensaje de confirmación</w:t>
-            </w:r>
-          </w:p>
-          <w:p>
-            <w:pPr>
-              <w:pStyle w:val="TableContents"/>
-              <w:numPr>
-                <w:ilvl w:val="0"/>
-                <w:numId w:val="2"/>
-              </w:numPr>
-              <w:rPr>
-                <w:b/>
-                <w:bCs/>
-              </w:rPr>
-            </w:pPr>
-            <w:r>
-              <w:t>El sistema redirige a página principal “Home”</w:t>
-            </w:r>
+              <w:rPr>
+                <w:b/>
+                <w:bCs/>
+              </w:rPr>
+            </w:pPr>
           </w:p>
         </w:tc>
       </w:tr>
@@ -6184,6 +6233,80 @@
               <w:t>Tener una cuenta activa</w:t>
             </w:r>
           </w:p>
+          <w:p>
+            <w:pPr>
+              <w:pStyle w:val="TableContents"/>
+              <w:numPr>
+                <w:ilvl w:val="0"/>
+                <w:numId w:val="2"/>
+              </w:numPr>
+              <w:rPr>
+                <w:color w:val="000000"/>
+              </w:rPr>
+            </w:pPr>
+            <w:r>
+              <w:rPr>
+                <w:color w:val="000000"/>
+              </w:rPr>
+              <w:t xml:space="preserve">Encontrase </w:t>
+            </w:r>
+            <w:proofErr w:type="spellStart"/>
+            <w:r>
+              <w:rPr>
+                <w:color w:val="000000"/>
+              </w:rPr>
+              <w:t>logueado</w:t>
+            </w:r>
+            <w:proofErr w:type="spellEnd"/>
+            <w:r>
+              <w:rPr>
+                <w:color w:val="000000"/>
+              </w:rPr>
+              <w:t xml:space="preserve"> como Empresa</w:t>
+            </w:r>
+          </w:p>
+          <w:p>
+            <w:pPr>
+              <w:pStyle w:val="TableContents"/>
+              <w:numPr>
+                <w:ilvl w:val="0"/>
+                <w:numId w:val="2"/>
+              </w:numPr>
+              <w:rPr>
+                <w:color w:val="000000"/>
+              </w:rPr>
+            </w:pPr>
+            <w:r>
+              <w:rPr>
+                <w:color w:val="000000"/>
+              </w:rPr>
+              <w:t xml:space="preserve">Encontrase en la opción Publicación &gt; </w:t>
+            </w:r>
+            <w:r>
+              <w:rPr>
+                <w:color w:val="000000"/>
+              </w:rPr>
+              <w:t>Nueva Publicación</w:t>
+            </w:r>
+          </w:p>
+          <w:p>
+            <w:pPr>
+              <w:pStyle w:val="TableContents"/>
+              <w:numPr>
+                <w:ilvl w:val="0"/>
+                <w:numId w:val="2"/>
+              </w:numPr>
+              <w:rPr>
+                <w:color w:val="000000"/>
+              </w:rPr>
+            </w:pPr>
+            <w:r>
+              <w:rPr>
+                <w:color w:val="000000"/>
+              </w:rPr>
+              <w:t>Encontrarse en la interfaz de crear publicación</w:t>
+            </w:r>
+          </w:p>
         </w:tc>
       </w:tr>
       <w:tr>
@@ -6385,29 +6508,11 @@
                 <w:ilvl w:val="0"/>
                 <w:numId w:val="2"/>
               </w:numPr>
-            </w:pPr>
-            <w:r>
-              <w:t>El</w:t>
-            </w:r>
-            <w:r>
-              <w:t xml:space="preserve"> sistema mostro un mensaje de advertencia </w:t>
-            </w:r>
-          </w:p>
-          <w:p>
-            <w:pPr>
-              <w:pStyle w:val="TableContents"/>
-              <w:numPr>
-                <w:ilvl w:val="0"/>
-                <w:numId w:val="2"/>
-              </w:numPr>
-              <w:rPr>
-                <w:b/>
-                <w:bCs/>
-              </w:rPr>
-            </w:pPr>
-            <w:r>
-              <w:t>No hubo redirecciona de pagina</w:t>
-            </w:r>
+              <w:rPr>
+                <w:b/>
+                <w:bCs/>
+              </w:rPr>
+            </w:pPr>
           </w:p>
         </w:tc>
       </w:tr>
@@ -6669,7 +6774,58 @@
               <w:rPr>
                 <w:color w:val="000000"/>
               </w:rPr>
+              <w:t xml:space="preserve">Encontrase </w:t>
+            </w:r>
+            <w:proofErr w:type="spellStart"/>
+            <w:r>
+              <w:rPr>
+                <w:color w:val="000000"/>
+              </w:rPr>
+              <w:t>logueado</w:t>
+            </w:r>
+            <w:proofErr w:type="spellEnd"/>
+            <w:r>
+              <w:rPr>
+                <w:color w:val="000000"/>
+              </w:rPr>
+              <w:t xml:space="preserve"> como Empresa</w:t>
+            </w:r>
+          </w:p>
+          <w:p>
+            <w:pPr>
+              <w:pStyle w:val="TableContents"/>
+              <w:numPr>
+                <w:ilvl w:val="0"/>
+                <w:numId w:val="2"/>
+              </w:numPr>
+              <w:rPr>
+                <w:color w:val="000000"/>
+              </w:rPr>
+            </w:pPr>
+            <w:r>
+              <w:rPr>
+                <w:color w:val="000000"/>
+              </w:rPr>
               <w:t>Haber creado al menos una publicación</w:t>
+            </w:r>
+          </w:p>
+          <w:p>
+            <w:pPr>
+              <w:pStyle w:val="TableContents"/>
+              <w:numPr>
+                <w:ilvl w:val="0"/>
+                <w:numId w:val="2"/>
+              </w:numPr>
+              <w:rPr>
+                <w:color w:val="000000"/>
+              </w:rPr>
+            </w:pPr>
+            <w:r>
+              <w:rPr>
+                <w:color w:val="000000"/>
+              </w:rPr>
+              <w:lastRenderedPageBreak/>
+              <w:t>Estar en la interfaz “Mi Perfil”</w:t>
             </w:r>
           </w:p>
         </w:tc>
@@ -6708,6 +6864,7 @@
                 <w:b/>
                 <w:bCs/>
               </w:rPr>
+              <w:lastRenderedPageBreak/>
               <w:t>Pasos</w:t>
             </w:r>
           </w:p>
@@ -6752,14 +6909,34 @@
               <w:rPr>
                 <w:lang w:val="es-PE"/>
               </w:rPr>
-              <w:t>Hace Click en “Home”</w:t>
+              <w:t>Hace Click en “</w:t>
             </w:r>
             <w:r>
               <w:rPr>
                 <w:lang w:val="es-PE"/>
               </w:rPr>
-              <w:t xml:space="preserve"> del navbar</w:t>
-            </w:r>
+              <w:t>Mi Perfil</w:t>
+            </w:r>
+            <w:r>
+              <w:rPr>
+                <w:lang w:val="es-PE"/>
+              </w:rPr>
+              <w:t>”</w:t>
+            </w:r>
+            <w:r>
+              <w:rPr>
+                <w:lang w:val="es-PE"/>
+              </w:rPr>
+              <w:t xml:space="preserve"> del </w:t>
+            </w:r>
+            <w:proofErr w:type="spellStart"/>
+            <w:r>
+              <w:rPr>
+                <w:lang w:val="es-PE"/>
+              </w:rPr>
+              <w:t>navbar</w:t>
+            </w:r>
+            <w:proofErr w:type="spellEnd"/>
           </w:p>
         </w:tc>
       </w:tr>
@@ -6812,7 +6989,6 @@
               <w:rPr>
                 <w:color w:val="000000"/>
               </w:rPr>
-              <w:lastRenderedPageBreak/>
               <w:t>Mostrar todas las publicaciones del usuario</w:t>
             </w:r>
           </w:p>
@@ -6865,9 +7041,6 @@
                 <w:bCs/>
               </w:rPr>
             </w:pPr>
-            <w:r>
-              <w:t>Se mostraron todas la publicaciones del usuario</w:t>
-            </w:r>
           </w:p>
         </w:tc>
       </w:tr>
@@ -7125,6 +7298,74 @@
               <w:t>Tener una cuenta activa</w:t>
             </w:r>
           </w:p>
+          <w:p>
+            <w:pPr>
+              <w:pStyle w:val="TableContents"/>
+              <w:numPr>
+                <w:ilvl w:val="0"/>
+                <w:numId w:val="2"/>
+              </w:numPr>
+              <w:rPr>
+                <w:color w:val="000000"/>
+              </w:rPr>
+            </w:pPr>
+            <w:r>
+              <w:rPr>
+                <w:color w:val="000000"/>
+              </w:rPr>
+              <w:t xml:space="preserve">Encontrase </w:t>
+            </w:r>
+            <w:proofErr w:type="spellStart"/>
+            <w:r>
+              <w:rPr>
+                <w:color w:val="000000"/>
+              </w:rPr>
+              <w:t>logueado</w:t>
+            </w:r>
+            <w:proofErr w:type="spellEnd"/>
+            <w:r>
+              <w:rPr>
+                <w:color w:val="000000"/>
+              </w:rPr>
+              <w:t xml:space="preserve"> como Empresa</w:t>
+            </w:r>
+          </w:p>
+          <w:p>
+            <w:pPr>
+              <w:pStyle w:val="TableContents"/>
+              <w:numPr>
+                <w:ilvl w:val="0"/>
+                <w:numId w:val="2"/>
+              </w:numPr>
+              <w:rPr>
+                <w:color w:val="000000"/>
+              </w:rPr>
+            </w:pPr>
+            <w:r>
+              <w:rPr>
+                <w:color w:val="000000"/>
+              </w:rPr>
+              <w:t>No tener creado publicaciones</w:t>
+            </w:r>
+          </w:p>
+          <w:p>
+            <w:pPr>
+              <w:pStyle w:val="TableContents"/>
+              <w:numPr>
+                <w:ilvl w:val="0"/>
+                <w:numId w:val="2"/>
+              </w:numPr>
+              <w:rPr>
+                <w:color w:val="000000"/>
+              </w:rPr>
+            </w:pPr>
+            <w:r>
+              <w:rPr>
+                <w:color w:val="000000"/>
+              </w:rPr>
+              <w:t>Estar en la interfaz “Mi Perfil”</w:t>
+            </w:r>
+          </w:p>
         </w:tc>
       </w:tr>
       <w:tr>
@@ -7205,14 +7446,34 @@
               <w:rPr>
                 <w:lang w:val="es-PE"/>
               </w:rPr>
-              <w:t>Hace Click en “Home”</w:t>
+              <w:t>Hace Click en “</w:t>
             </w:r>
             <w:r>
               <w:rPr>
                 <w:lang w:val="es-PE"/>
               </w:rPr>
-              <w:t xml:space="preserve"> del navbar</w:t>
-            </w:r>
+              <w:t>Mi Perfil</w:t>
+            </w:r>
+            <w:r>
+              <w:rPr>
+                <w:lang w:val="es-PE"/>
+              </w:rPr>
+              <w:t>”</w:t>
+            </w:r>
+            <w:r>
+              <w:rPr>
+                <w:lang w:val="es-PE"/>
+              </w:rPr>
+              <w:t xml:space="preserve"> del </w:t>
+            </w:r>
+            <w:proofErr w:type="spellStart"/>
+            <w:r>
+              <w:rPr>
+                <w:lang w:val="es-PE"/>
+              </w:rPr>
+              <w:t>navbar</w:t>
+            </w:r>
+            <w:proofErr w:type="spellEnd"/>
           </w:p>
         </w:tc>
       </w:tr>
@@ -7317,9 +7578,6 @@
                 <w:bCs/>
               </w:rPr>
             </w:pPr>
-            <w:r>
-              <w:t>Se mostro un mensaje de “No hay datos disponibles” en la tabla de publicaciones</w:t>
-            </w:r>
           </w:p>
         </w:tc>
       </w:tr>
@@ -7563,6 +7821,110 @@
               <w:t>Tener una cuenta activa</w:t>
             </w:r>
           </w:p>
+          <w:p>
+            <w:pPr>
+              <w:pStyle w:val="TableContents"/>
+              <w:numPr>
+                <w:ilvl w:val="0"/>
+                <w:numId w:val="2"/>
+              </w:numPr>
+              <w:rPr>
+                <w:color w:val="000000"/>
+              </w:rPr>
+            </w:pPr>
+            <w:r>
+              <w:rPr>
+                <w:color w:val="000000"/>
+              </w:rPr>
+              <w:t xml:space="preserve">Encontrase </w:t>
+            </w:r>
+            <w:proofErr w:type="spellStart"/>
+            <w:r>
+              <w:rPr>
+                <w:color w:val="000000"/>
+              </w:rPr>
+              <w:t>logueado</w:t>
+            </w:r>
+            <w:proofErr w:type="spellEnd"/>
+            <w:r>
+              <w:rPr>
+                <w:color w:val="000000"/>
+              </w:rPr>
+              <w:t xml:space="preserve"> como Empresa</w:t>
+            </w:r>
+          </w:p>
+          <w:p>
+            <w:pPr>
+              <w:pStyle w:val="TableContents"/>
+              <w:numPr>
+                <w:ilvl w:val="0"/>
+                <w:numId w:val="2"/>
+              </w:numPr>
+              <w:rPr>
+                <w:color w:val="000000"/>
+              </w:rPr>
+            </w:pPr>
+            <w:r>
+              <w:rPr>
+                <w:color w:val="000000"/>
+              </w:rPr>
+              <w:t>Haber creado al menos una publicación</w:t>
+            </w:r>
+          </w:p>
+          <w:p>
+            <w:pPr>
+              <w:pStyle w:val="TableContents"/>
+              <w:numPr>
+                <w:ilvl w:val="0"/>
+                <w:numId w:val="2"/>
+              </w:numPr>
+              <w:rPr>
+                <w:color w:val="000000"/>
+              </w:rPr>
+            </w:pPr>
+            <w:r>
+              <w:rPr>
+                <w:color w:val="000000"/>
+              </w:rPr>
+              <w:t>Estar en la interfaz “Mi Perfil”</w:t>
+            </w:r>
+          </w:p>
+          <w:p>
+            <w:pPr>
+              <w:pStyle w:val="TableContents"/>
+              <w:numPr>
+                <w:ilvl w:val="0"/>
+                <w:numId w:val="2"/>
+              </w:numPr>
+              <w:rPr>
+                <w:color w:val="000000"/>
+              </w:rPr>
+            </w:pPr>
+            <w:r>
+              <w:rPr>
+                <w:color w:val="000000"/>
+              </w:rPr>
+              <w:t>Seleccionar una publicación &gt; Detalle publicación</w:t>
+            </w:r>
+          </w:p>
+          <w:p>
+            <w:pPr>
+              <w:pStyle w:val="TableContents"/>
+              <w:numPr>
+                <w:ilvl w:val="0"/>
+                <w:numId w:val="2"/>
+              </w:numPr>
+              <w:rPr>
+                <w:color w:val="000000"/>
+              </w:rPr>
+            </w:pPr>
+            <w:r>
+              <w:rPr>
+                <w:color w:val="000000"/>
+              </w:rPr>
+              <w:t>Encontrarse en el la interfaz “Detalle Publicación”</w:t>
+            </w:r>
+          </w:p>
         </w:tc>
       </w:tr>
       <w:tr>
@@ -7801,26 +8163,11 @@
                 <w:ilvl w:val="0"/>
                 <w:numId w:val="2"/>
               </w:numPr>
-            </w:pPr>
-            <w:r>
-              <w:t>El sistema mostro un mensaje de confirmación</w:t>
-            </w:r>
-          </w:p>
-          <w:p>
-            <w:pPr>
-              <w:pStyle w:val="TableContents"/>
-              <w:numPr>
-                <w:ilvl w:val="0"/>
-                <w:numId w:val="2"/>
-              </w:numPr>
-              <w:rPr>
-                <w:b/>
-                <w:bCs/>
-              </w:rPr>
-            </w:pPr>
-            <w:r>
-              <w:t>El sistema redirige a página principal “Home”</w:t>
-            </w:r>
+              <w:rPr>
+                <w:b/>
+                <w:bCs/>
+              </w:rPr>
+            </w:pPr>
           </w:p>
         </w:tc>
       </w:tr>
@@ -7967,6 +8314,7 @@
                 <w:b/>
                 <w:bCs/>
               </w:rPr>
+              <w:lastRenderedPageBreak/>
               <w:t>Historia Relacionada N0004:</w:t>
             </w:r>
             <w:r>
@@ -8076,7 +8424,75 @@
               <w:rPr>
                 <w:color w:val="000000"/>
               </w:rPr>
-              <w:t>Tener una publicación activa</w:t>
+              <w:t xml:space="preserve">Encontrase </w:t>
+            </w:r>
+            <w:proofErr w:type="spellStart"/>
+            <w:r>
+              <w:rPr>
+                <w:color w:val="000000"/>
+              </w:rPr>
+              <w:t>logueado</w:t>
+            </w:r>
+            <w:proofErr w:type="spellEnd"/>
+            <w:r>
+              <w:rPr>
+                <w:color w:val="000000"/>
+              </w:rPr>
+              <w:t xml:space="preserve"> como Empresa</w:t>
+            </w:r>
+          </w:p>
+          <w:p>
+            <w:pPr>
+              <w:pStyle w:val="TableContents"/>
+              <w:numPr>
+                <w:ilvl w:val="0"/>
+                <w:numId w:val="2"/>
+              </w:numPr>
+              <w:rPr>
+                <w:color w:val="000000"/>
+              </w:rPr>
+            </w:pPr>
+            <w:r>
+              <w:rPr>
+                <w:color w:val="000000"/>
+              </w:rPr>
+              <w:t>Haber creado al menos una publicación</w:t>
+            </w:r>
+          </w:p>
+          <w:p>
+            <w:pPr>
+              <w:pStyle w:val="TableContents"/>
+              <w:numPr>
+                <w:ilvl w:val="0"/>
+                <w:numId w:val="2"/>
+              </w:numPr>
+              <w:rPr>
+                <w:color w:val="000000"/>
+              </w:rPr>
+            </w:pPr>
+            <w:r>
+              <w:rPr>
+                <w:color w:val="000000"/>
+              </w:rPr>
+              <w:t>Estar en la interfaz “Mi Perfil”</w:t>
+            </w:r>
+          </w:p>
+          <w:p>
+            <w:pPr>
+              <w:pStyle w:val="TableContents"/>
+              <w:numPr>
+                <w:ilvl w:val="0"/>
+                <w:numId w:val="2"/>
+              </w:numPr>
+              <w:rPr>
+                <w:color w:val="000000"/>
+              </w:rPr>
+            </w:pPr>
+            <w:r>
+              <w:rPr>
+                <w:color w:val="000000"/>
+              </w:rPr>
+              <w:t>Seleccionar una publicación &gt; Eliminar Publicación</w:t>
             </w:r>
           </w:p>
         </w:tc>
@@ -8246,7 +8662,6 @@
                 <w:b/>
                 <w:bCs/>
               </w:rPr>
-              <w:lastRenderedPageBreak/>
               <w:t>Resultado esperado:</w:t>
             </w:r>
           </w:p>
@@ -8331,34 +8746,10 @@
                 <w:numId w:val="2"/>
               </w:numPr>
               <w:rPr>
-                <w:color w:val="000000"/>
-              </w:rPr>
-            </w:pPr>
-            <w:r>
-              <w:rPr>
-                <w:color w:val="000000"/>
-              </w:rPr>
-              <w:t>Mostrar un mensaje de confirmación</w:t>
-            </w:r>
-          </w:p>
-          <w:p>
-            <w:pPr>
-              <w:pStyle w:val="TableContents"/>
-              <w:numPr>
-                <w:ilvl w:val="0"/>
-                <w:numId w:val="2"/>
-              </w:numPr>
-              <w:rPr>
-                <w:b/>
-                <w:bCs/>
-              </w:rPr>
-            </w:pPr>
-            <w:r>
-              <w:rPr>
-                <w:color w:val="000000"/>
-              </w:rPr>
-              <w:t>Actualizar la tabla de publicaciones</w:t>
-            </w:r>
+                <w:b/>
+                <w:bCs/>
+              </w:rPr>
+            </w:pPr>
           </w:p>
         </w:tc>
       </w:tr>
@@ -8623,7 +9014,75 @@
               <w:rPr>
                 <w:color w:val="000000"/>
               </w:rPr>
-              <w:t>Tener una publicación activa</w:t>
+              <w:t xml:space="preserve">Encontrase </w:t>
+            </w:r>
+            <w:proofErr w:type="spellStart"/>
+            <w:r>
+              <w:rPr>
+                <w:color w:val="000000"/>
+              </w:rPr>
+              <w:t>logueado</w:t>
+            </w:r>
+            <w:proofErr w:type="spellEnd"/>
+            <w:r>
+              <w:rPr>
+                <w:color w:val="000000"/>
+              </w:rPr>
+              <w:t xml:space="preserve"> como Empresa</w:t>
+            </w:r>
+          </w:p>
+          <w:p>
+            <w:pPr>
+              <w:pStyle w:val="TableContents"/>
+              <w:numPr>
+                <w:ilvl w:val="0"/>
+                <w:numId w:val="2"/>
+              </w:numPr>
+              <w:rPr>
+                <w:color w:val="000000"/>
+              </w:rPr>
+            </w:pPr>
+            <w:r>
+              <w:rPr>
+                <w:color w:val="000000"/>
+              </w:rPr>
+              <w:t>Haber creado al menos una publicación</w:t>
+            </w:r>
+          </w:p>
+          <w:p>
+            <w:pPr>
+              <w:pStyle w:val="TableContents"/>
+              <w:numPr>
+                <w:ilvl w:val="0"/>
+                <w:numId w:val="2"/>
+              </w:numPr>
+              <w:rPr>
+                <w:color w:val="000000"/>
+              </w:rPr>
+            </w:pPr>
+            <w:r>
+              <w:rPr>
+                <w:color w:val="000000"/>
+              </w:rPr>
+              <w:t>Estar en la interfaz “Mi Perfil”</w:t>
+            </w:r>
+          </w:p>
+          <w:p>
+            <w:pPr>
+              <w:pStyle w:val="TableContents"/>
+              <w:numPr>
+                <w:ilvl w:val="0"/>
+                <w:numId w:val="2"/>
+              </w:numPr>
+              <w:rPr>
+                <w:color w:val="000000"/>
+              </w:rPr>
+            </w:pPr>
+            <w:r>
+              <w:rPr>
+                <w:color w:val="000000"/>
+              </w:rPr>
+              <w:t>Seleccionar una publicación &gt; Eliminar Publicación</w:t>
             </w:r>
           </w:p>
         </w:tc>
@@ -8863,12 +9322,6 @@
                 <w:bCs/>
               </w:rPr>
             </w:pPr>
-            <w:r>
-              <w:rPr>
-                <w:color w:val="000000"/>
-              </w:rPr>
-              <w:t>Se cerro el modal de confirmación</w:t>
-            </w:r>
           </w:p>
         </w:tc>
       </w:tr>
@@ -9268,6 +9721,7 @@
               <w:rPr>
                 <w:color w:val="000000"/>
               </w:rPr>
+              <w:lastRenderedPageBreak/>
               <w:t>Visualizar las publicaciones disponibles</w:t>
             </w:r>
           </w:p>
@@ -9305,6 +9759,7 @@
                 <w:b/>
                 <w:bCs/>
               </w:rPr>
+              <w:lastRenderedPageBreak/>
               <w:t>Resultado obtenido:</w:t>
             </w:r>
           </w:p>
@@ -9320,12 +9775,6 @@
                 <w:bCs/>
               </w:rPr>
             </w:pPr>
-            <w:r>
-              <w:rPr>
-                <w:color w:val="000000"/>
-              </w:rPr>
-              <w:t>Mostrar las publicaciones activas</w:t>
-            </w:r>
           </w:p>
         </w:tc>
       </w:tr>
@@ -9592,6 +10041,24 @@
               <w:t xml:space="preserve"> (opcional)</w:t>
             </w:r>
           </w:p>
+          <w:p>
+            <w:pPr>
+              <w:pStyle w:val="TableContents"/>
+              <w:numPr>
+                <w:ilvl w:val="0"/>
+                <w:numId w:val="2"/>
+              </w:numPr>
+              <w:rPr>
+                <w:color w:val="000000"/>
+              </w:rPr>
+            </w:pPr>
+            <w:r>
+              <w:rPr>
+                <w:color w:val="000000"/>
+              </w:rPr>
+              <w:t>No tener una publicaciones activas</w:t>
+            </w:r>
+          </w:p>
         </w:tc>
       </w:tr>
       <w:tr>
@@ -9709,7 +10176,6 @@
                 <w:b/>
                 <w:bCs/>
               </w:rPr>
-              <w:lastRenderedPageBreak/>
               <w:t>Resultado esperado:</w:t>
             </w:r>
           </w:p>
@@ -9728,13 +10194,7 @@
               <w:rPr>
                 <w:color w:val="000000"/>
               </w:rPr>
-              <w:t xml:space="preserve">Visualizar </w:t>
-            </w:r>
-            <w:r>
-              <w:rPr>
-                <w:color w:val="000000"/>
-              </w:rPr>
-              <w:t>mensaje de “No hay publicaciones disponibles”</w:t>
+              <w:t>Visualizar mensaje de “No hay publicaciones disponibles”</w:t>
             </w:r>
           </w:p>
         </w:tc>
@@ -9786,18 +10246,6 @@
                 <w:bCs/>
               </w:rPr>
             </w:pPr>
-            <w:r>
-              <w:rPr>
-                <w:color w:val="000000"/>
-              </w:rPr>
-              <w:t xml:space="preserve">Mostrar </w:t>
-            </w:r>
-            <w:r>
-              <w:rPr>
-                <w:color w:val="000000"/>
-              </w:rPr>
-              <w:t>un mensaje de “No hay publicaciones disponibles”</w:t>
-            </w:r>
           </w:p>
         </w:tc>
       </w:tr>
@@ -9872,7 +10320,15 @@
               <w:t>Descripción de Caso de Prueba</w:t>
             </w:r>
             <w:r>
-              <w:t>: Visualización de detallae de publicaciones</w:t>
+              <w:t xml:space="preserve">: Visualización de </w:t>
+            </w:r>
+            <w:proofErr w:type="spellStart"/>
+            <w:r>
+              <w:t>detallae</w:t>
+            </w:r>
+            <w:proofErr w:type="spellEnd"/>
+            <w:r>
+              <w:t xml:space="preserve"> de publicaciones</w:t>
             </w:r>
           </w:p>
         </w:tc>
@@ -10206,7 +10662,7 @@
               <w:rPr>
                 <w:color w:val="000000"/>
               </w:rPr>
-              <w:t>Se visualiza mas detalle de la publicación (incluido el creador)</w:t>
+              <w:t>Se visualiza más detalle de la publicación (incluido el creador)</w:t>
             </w:r>
           </w:p>
         </w:tc>
@@ -10258,24 +10714,6 @@
                 <w:bCs/>
               </w:rPr>
             </w:pPr>
-            <w:r>
-              <w:rPr>
-                <w:color w:val="000000"/>
-              </w:rPr>
-              <w:t xml:space="preserve">Se visualiza </w:t>
-            </w:r>
-            <w:r>
-              <w:rPr>
-                <w:color w:val="000000"/>
-              </w:rPr>
-              <w:t>más</w:t>
-            </w:r>
-            <w:r>
-              <w:rPr>
-                <w:color w:val="000000"/>
-              </w:rPr>
-              <w:t xml:space="preserve"> detalle de la publicación (incluido el creador)</w:t>
-            </w:r>
           </w:p>
         </w:tc>
       </w:tr>
@@ -10547,47 +10985,109 @@
               </w:rPr>
               <w:t>Tener una cuenta activa</w:t>
             </w:r>
-            <w:r>
-              <w:rPr>
-                <w:color w:val="000000"/>
-              </w:rPr>
-              <w:t xml:space="preserve"> como comprador</w:t>
-            </w:r>
-          </w:p>
-          <w:p>
-            <w:pPr>
-              <w:pStyle w:val="TableContents"/>
-              <w:numPr>
-                <w:ilvl w:val="0"/>
-                <w:numId w:val="2"/>
-              </w:numPr>
-              <w:rPr>
-                <w:color w:val="000000"/>
-              </w:rPr>
-            </w:pPr>
-            <w:r>
-              <w:rPr>
-                <w:color w:val="000000"/>
-              </w:rPr>
-              <w:t>Tener publicaciones activas</w:t>
-            </w:r>
-          </w:p>
-          <w:p>
-            <w:pPr>
-              <w:pStyle w:val="TableContents"/>
-              <w:numPr>
-                <w:ilvl w:val="0"/>
-                <w:numId w:val="2"/>
-              </w:numPr>
-              <w:rPr>
-                <w:color w:val="000000"/>
-              </w:rPr>
-            </w:pPr>
-            <w:r>
-              <w:rPr>
-                <w:color w:val="000000"/>
-              </w:rPr>
-              <w:t>Visitar la página de detalle de la publicación</w:t>
+          </w:p>
+          <w:p>
+            <w:pPr>
+              <w:pStyle w:val="TableContents"/>
+              <w:numPr>
+                <w:ilvl w:val="0"/>
+                <w:numId w:val="2"/>
+              </w:numPr>
+              <w:rPr>
+                <w:color w:val="000000"/>
+              </w:rPr>
+            </w:pPr>
+            <w:r>
+              <w:rPr>
+                <w:color w:val="000000"/>
+              </w:rPr>
+              <w:t xml:space="preserve">Encontrase </w:t>
+            </w:r>
+            <w:proofErr w:type="spellStart"/>
+            <w:r>
+              <w:rPr>
+                <w:color w:val="000000"/>
+              </w:rPr>
+              <w:t>logueado</w:t>
+            </w:r>
+            <w:proofErr w:type="spellEnd"/>
+            <w:r>
+              <w:rPr>
+                <w:color w:val="000000"/>
+              </w:rPr>
+              <w:t xml:space="preserve"> como Persona</w:t>
+            </w:r>
+          </w:p>
+          <w:p>
+            <w:pPr>
+              <w:pStyle w:val="TableContents"/>
+              <w:numPr>
+                <w:ilvl w:val="0"/>
+                <w:numId w:val="2"/>
+              </w:numPr>
+              <w:rPr>
+                <w:color w:val="000000"/>
+              </w:rPr>
+            </w:pPr>
+            <w:r>
+              <w:rPr>
+                <w:color w:val="000000"/>
+              </w:rPr>
+              <w:t>Tener disponible al menos una publicación</w:t>
+            </w:r>
+          </w:p>
+          <w:p>
+            <w:pPr>
+              <w:pStyle w:val="TableContents"/>
+              <w:numPr>
+                <w:ilvl w:val="0"/>
+                <w:numId w:val="2"/>
+              </w:numPr>
+              <w:rPr>
+                <w:color w:val="000000"/>
+              </w:rPr>
+            </w:pPr>
+            <w:r>
+              <w:rPr>
+                <w:color w:val="000000"/>
+              </w:rPr>
+              <w:t>Estar en la interfaz “Post”</w:t>
+            </w:r>
+          </w:p>
+          <w:p>
+            <w:pPr>
+              <w:pStyle w:val="TableContents"/>
+              <w:numPr>
+                <w:ilvl w:val="0"/>
+                <w:numId w:val="2"/>
+              </w:numPr>
+              <w:rPr>
+                <w:color w:val="000000"/>
+              </w:rPr>
+            </w:pPr>
+            <w:r>
+              <w:rPr>
+                <w:color w:val="000000"/>
+              </w:rPr>
+              <w:t>Seleccionar una publicación &gt; Detalle publicación</w:t>
+            </w:r>
+          </w:p>
+          <w:p>
+            <w:pPr>
+              <w:pStyle w:val="TableContents"/>
+              <w:numPr>
+                <w:ilvl w:val="0"/>
+                <w:numId w:val="2"/>
+              </w:numPr>
+              <w:rPr>
+                <w:color w:val="000000"/>
+              </w:rPr>
+            </w:pPr>
+            <w:r>
+              <w:rPr>
+                <w:color w:val="000000"/>
+              </w:rPr>
+              <w:t>Encontrarse en el la interfaz “Detalle Publicación”</w:t>
             </w:r>
           </w:p>
         </w:tc>
@@ -10683,6 +11183,7 @@
               <w:rPr>
                 <w:color w:val="000000"/>
               </w:rPr>
+              <w:lastRenderedPageBreak/>
               <w:t>Ver el detalle de la publicación</w:t>
             </w:r>
           </w:p>
@@ -10702,13 +11203,7 @@
               <w:rPr>
                 <w:color w:val="000000"/>
               </w:rPr>
-              <w:t>Hacer Click en “Solicitar”</w:t>
-            </w:r>
-            <w:r>
-              <w:rPr>
-                <w:color w:val="000000"/>
-              </w:rPr>
-              <w:t xml:space="preserve"> </w:t>
+              <w:t xml:space="preserve">Hacer Click en “Solicitar” </w:t>
             </w:r>
           </w:p>
         </w:tc>
@@ -10744,6 +11239,7 @@
                 <w:b/>
                 <w:bCs/>
               </w:rPr>
+              <w:lastRenderedPageBreak/>
               <w:t>Resultado esperado:</w:t>
             </w:r>
           </w:p>
@@ -10762,13 +11258,7 @@
               <w:rPr>
                 <w:color w:val="000000"/>
               </w:rPr>
-              <w:t xml:space="preserve">Se visualiza </w:t>
-            </w:r>
-            <w:r>
-              <w:rPr>
-                <w:color w:val="000000"/>
-              </w:rPr>
-              <w:t>pantalla de detalle con botón “Solicitar”</w:t>
+              <w:t>Se visualiza pantalla de detalle con botón “Solicitar”</w:t>
             </w:r>
           </w:p>
           <w:p>
@@ -10856,50 +11346,6 @@
                 <w:bCs/>
               </w:rPr>
             </w:pPr>
-            <w:r>
-              <w:rPr>
-                <w:color w:val="000000"/>
-              </w:rPr>
-              <w:t>Se visualiza el botón “Solicitar”</w:t>
-            </w:r>
-          </w:p>
-          <w:p>
-            <w:pPr>
-              <w:pStyle w:val="TableContents"/>
-              <w:numPr>
-                <w:ilvl w:val="0"/>
-                <w:numId w:val="2"/>
-              </w:numPr>
-              <w:rPr>
-                <w:b/>
-                <w:bCs/>
-              </w:rPr>
-            </w:pPr>
-            <w:r>
-              <w:rPr>
-                <w:color w:val="000000"/>
-              </w:rPr>
-              <w:t>Se muestra el mensaje de confirmación</w:t>
-            </w:r>
-          </w:p>
-          <w:p>
-            <w:pPr>
-              <w:pStyle w:val="TableContents"/>
-              <w:numPr>
-                <w:ilvl w:val="0"/>
-                <w:numId w:val="2"/>
-              </w:numPr>
-              <w:rPr>
-                <w:b/>
-                <w:bCs/>
-              </w:rPr>
-            </w:pPr>
-            <w:r>
-              <w:rPr>
-                <w:color w:val="000000"/>
-              </w:rPr>
-              <w:t>Se redirige a la pantalla principal “HOME”</w:t>
-            </w:r>
           </w:p>
         </w:tc>
       </w:tr>
@@ -11143,26 +11589,111 @@
               <w:rPr>
                 <w:color w:val="000000"/>
               </w:rPr>
-              <w:t>Tener publicaciones activas</w:t>
-            </w:r>
-          </w:p>
-          <w:p>
-            <w:pPr>
-              <w:pStyle w:val="TableContents"/>
-              <w:numPr>
-                <w:ilvl w:val="0"/>
-                <w:numId w:val="2"/>
-              </w:numPr>
-              <w:rPr>
-                <w:color w:val="000000"/>
-              </w:rPr>
-            </w:pPr>
-            <w:r>
-              <w:rPr>
-                <w:color w:val="000000"/>
-              </w:rPr>
-              <w:lastRenderedPageBreak/>
-              <w:t>Visitar la página de detalle de la publicación</w:t>
+              <w:t>Tener una cuenta activa</w:t>
+            </w:r>
+            <w:r>
+              <w:rPr>
+                <w:color w:val="000000"/>
+              </w:rPr>
+              <w:t xml:space="preserve"> (opcional)</w:t>
+            </w:r>
+          </w:p>
+          <w:p>
+            <w:pPr>
+              <w:pStyle w:val="TableContents"/>
+              <w:numPr>
+                <w:ilvl w:val="0"/>
+                <w:numId w:val="2"/>
+              </w:numPr>
+              <w:rPr>
+                <w:color w:val="000000"/>
+              </w:rPr>
+            </w:pPr>
+            <w:r>
+              <w:rPr>
+                <w:color w:val="000000"/>
+              </w:rPr>
+              <w:t xml:space="preserve">No encontrase </w:t>
+            </w:r>
+            <w:proofErr w:type="spellStart"/>
+            <w:r>
+              <w:rPr>
+                <w:color w:val="000000"/>
+              </w:rPr>
+              <w:t>logueado</w:t>
+            </w:r>
+            <w:proofErr w:type="spellEnd"/>
+          </w:p>
+          <w:p>
+            <w:pPr>
+              <w:pStyle w:val="TableContents"/>
+              <w:numPr>
+                <w:ilvl w:val="0"/>
+                <w:numId w:val="2"/>
+              </w:numPr>
+              <w:rPr>
+                <w:color w:val="000000"/>
+              </w:rPr>
+            </w:pPr>
+            <w:r>
+              <w:rPr>
+                <w:color w:val="000000"/>
+              </w:rPr>
+              <w:t>Tener disponible al menos una publicación</w:t>
+            </w:r>
+          </w:p>
+          <w:p>
+            <w:pPr>
+              <w:pStyle w:val="TableContents"/>
+              <w:numPr>
+                <w:ilvl w:val="0"/>
+                <w:numId w:val="2"/>
+              </w:numPr>
+              <w:rPr>
+                <w:color w:val="000000"/>
+              </w:rPr>
+            </w:pPr>
+            <w:r>
+              <w:rPr>
+                <w:color w:val="000000"/>
+              </w:rPr>
+              <w:t>Estar en la interfaz “Post”</w:t>
+            </w:r>
+          </w:p>
+          <w:p>
+            <w:pPr>
+              <w:pStyle w:val="TableContents"/>
+              <w:numPr>
+                <w:ilvl w:val="0"/>
+                <w:numId w:val="2"/>
+              </w:numPr>
+              <w:rPr>
+                <w:color w:val="000000"/>
+              </w:rPr>
+            </w:pPr>
+            <w:r>
+              <w:rPr>
+                <w:color w:val="000000"/>
+              </w:rPr>
+              <w:t>Seleccionar una publicación &gt; Detalle publicación</w:t>
+            </w:r>
+          </w:p>
+          <w:p>
+            <w:pPr>
+              <w:pStyle w:val="TableContents"/>
+              <w:numPr>
+                <w:ilvl w:val="0"/>
+                <w:numId w:val="2"/>
+              </w:numPr>
+              <w:rPr>
+                <w:color w:val="000000"/>
+              </w:rPr>
+            </w:pPr>
+            <w:r>
+              <w:rPr>
+                <w:color w:val="000000"/>
+              </w:rPr>
+              <w:t>Encontrarse en el la interfaz “Detalle Publicación”</w:t>
             </w:r>
           </w:p>
         </w:tc>
@@ -11419,49 +11950,6 @@
                 <w:bCs/>
               </w:rPr>
             </w:pPr>
-            <w:r>
-              <w:rPr>
-                <w:color w:val="000000"/>
-              </w:rPr>
-              <w:t>Se visualiza el botón “Solicitar”</w:t>
-            </w:r>
-          </w:p>
-          <w:p>
-            <w:pPr>
-              <w:pStyle w:val="TableContents"/>
-              <w:numPr>
-                <w:ilvl w:val="0"/>
-                <w:numId w:val="2"/>
-              </w:numPr>
-              <w:rPr>
-                <w:color w:val="000000"/>
-              </w:rPr>
-            </w:pPr>
-            <w:r>
-              <w:rPr>
-                <w:color w:val="000000"/>
-              </w:rPr>
-              <w:t>Muestra un mensaje “Debe registrarse para poder continuar”</w:t>
-            </w:r>
-          </w:p>
-          <w:p>
-            <w:pPr>
-              <w:pStyle w:val="TableContents"/>
-              <w:numPr>
-                <w:ilvl w:val="0"/>
-                <w:numId w:val="2"/>
-              </w:numPr>
-              <w:rPr>
-                <w:b/>
-                <w:bCs/>
-              </w:rPr>
-            </w:pPr>
-            <w:r>
-              <w:rPr>
-                <w:color w:val="000000"/>
-              </w:rPr>
-              <w:t>Redije a la pantalla de creación de cuenta</w:t>
-            </w:r>
           </w:p>
         </w:tc>
       </w:tr>
@@ -11542,7 +12030,15 @@
               <w:t>Descripción de Caso de Prueba: Flujo de confirmación de solicitud de compra</w:t>
             </w:r>
             <w:r>
-              <w:t xml:space="preserve"> mas detalle</w:t>
+              <w:t xml:space="preserve"> </w:t>
+            </w:r>
+            <w:proofErr w:type="spellStart"/>
+            <w:r>
+              <w:t>mas</w:t>
+            </w:r>
+            <w:proofErr w:type="spellEnd"/>
+            <w:r>
+              <w:t xml:space="preserve"> detalle</w:t>
             </w:r>
           </w:p>
         </w:tc>
@@ -11714,39 +12210,47 @@
                 <w:ilvl w:val="0"/>
                 <w:numId w:val="2"/>
               </w:numPr>
-            </w:pPr>
-            <w:r>
+              <w:rPr>
+                <w:color w:val="000000"/>
+              </w:rPr>
+            </w:pPr>
+            <w:r>
+              <w:rPr>
+                <w:color w:val="000000"/>
+              </w:rPr>
               <w:t>Tener una cuenta activa</w:t>
             </w:r>
-            <w:r>
-              <w:t xml:space="preserve"> (Estar logueado</w:t>
-            </w:r>
-            <w:r>
-              <w:t xml:space="preserve"> como </w:t>
-            </w:r>
-            <w:r>
-              <w:t>vendedor</w:t>
-            </w:r>
-            <w:r>
-              <w:t>)</w:t>
-            </w:r>
-          </w:p>
-          <w:p>
-            <w:pPr>
-              <w:pStyle w:val="TableContents"/>
-              <w:numPr>
-                <w:ilvl w:val="0"/>
-                <w:numId w:val="2"/>
-              </w:numPr>
-              <w:rPr>
-                <w:color w:val="000000"/>
-              </w:rPr>
-            </w:pPr>
-            <w:r>
-              <w:rPr>
-                <w:color w:val="000000"/>
-              </w:rPr>
-              <w:t>Tener publicaciones activas</w:t>
+          </w:p>
+          <w:p>
+            <w:pPr>
+              <w:pStyle w:val="TableContents"/>
+              <w:numPr>
+                <w:ilvl w:val="0"/>
+                <w:numId w:val="2"/>
+              </w:numPr>
+              <w:rPr>
+                <w:color w:val="000000"/>
+              </w:rPr>
+            </w:pPr>
+            <w:r>
+              <w:rPr>
+                <w:color w:val="000000"/>
+              </w:rPr>
+              <w:t xml:space="preserve">Encontrase </w:t>
+            </w:r>
+            <w:proofErr w:type="spellStart"/>
+            <w:r>
+              <w:rPr>
+                <w:color w:val="000000"/>
+              </w:rPr>
+              <w:t>logueado</w:t>
+            </w:r>
+            <w:proofErr w:type="spellEnd"/>
+            <w:r>
+              <w:rPr>
+                <w:color w:val="000000"/>
+              </w:rPr>
+              <w:t xml:space="preserve"> como Empresa</w:t>
             </w:r>
           </w:p>
           <w:p>
@@ -11765,6 +12269,57 @@
                 <w:color w:val="000000"/>
               </w:rPr>
               <w:t>Tener solicitudes de compra pendientes</w:t>
+            </w:r>
+          </w:p>
+          <w:p>
+            <w:pPr>
+              <w:pStyle w:val="TableContents"/>
+              <w:numPr>
+                <w:ilvl w:val="0"/>
+                <w:numId w:val="2"/>
+              </w:numPr>
+              <w:rPr>
+                <w:color w:val="000000"/>
+              </w:rPr>
+            </w:pPr>
+            <w:r>
+              <w:rPr>
+                <w:color w:val="000000"/>
+              </w:rPr>
+              <w:t>Estar en la interfaz “Solicitudes”</w:t>
+            </w:r>
+          </w:p>
+          <w:p>
+            <w:pPr>
+              <w:pStyle w:val="TableContents"/>
+              <w:ind w:left="720"/>
+              <w:rPr>
+                <w:color w:val="000000"/>
+              </w:rPr>
+            </w:pPr>
+            <w:r>
+              <w:rPr>
+                <w:color w:val="000000"/>
+              </w:rPr>
+              <w:t>Seleccionar una solicitud &gt; Detalle solicitud (Forma 2)</w:t>
+            </w:r>
+          </w:p>
+          <w:p>
+            <w:pPr>
+              <w:pStyle w:val="TableContents"/>
+              <w:numPr>
+                <w:ilvl w:val="0"/>
+                <w:numId w:val="2"/>
+              </w:numPr>
+              <w:rPr>
+                <w:color w:val="000000"/>
+              </w:rPr>
+            </w:pPr>
+            <w:r>
+              <w:rPr>
+                <w:color w:val="000000"/>
+              </w:rPr>
+              <w:t>Encontrarse en el la interfaz “Detalle solicitud” (Forma 2)</w:t>
             </w:r>
           </w:p>
         </w:tc>
@@ -11860,19 +12415,7 @@
               <w:rPr>
                 <w:color w:val="000000"/>
               </w:rPr>
-              <w:t xml:space="preserve">Hacer Click en </w:t>
-            </w:r>
-            <w:r>
-              <w:rPr>
-                <w:color w:val="000000"/>
-              </w:rPr>
-              <w:t>“Detalle</w:t>
-            </w:r>
-            <w:r>
-              <w:rPr>
-                <w:color w:val="000000"/>
-              </w:rPr>
-              <w:t xml:space="preserve">” </w:t>
+              <w:t xml:space="preserve">Hacer Click en “Detalle” </w:t>
             </w:r>
           </w:p>
         </w:tc>
@@ -11926,13 +12469,7 @@
               <w:rPr>
                 <w:color w:val="000000"/>
               </w:rPr>
-              <w:t xml:space="preserve">Se abre un modal de confirmación </w:t>
-            </w:r>
-            <w:r>
-              <w:rPr>
-                <w:color w:val="000000"/>
-              </w:rPr>
-              <w:t>“Mas detalle”</w:t>
+              <w:t>Se abre un modal de confirmación “Mas detalle”</w:t>
             </w:r>
           </w:p>
           <w:p>
@@ -12015,6 +12552,7 @@
                 <w:color w:val="000000"/>
                 <w:lang w:val="es-PE"/>
               </w:rPr>
+              <w:lastRenderedPageBreak/>
               <w:t>Se cierra el modal y se actualiza la tabla</w:t>
             </w:r>
           </w:p>
@@ -12052,6 +12590,7 @@
                 <w:b/>
                 <w:bCs/>
               </w:rPr>
+              <w:lastRenderedPageBreak/>
               <w:t>Resultado obtenido:</w:t>
             </w:r>
           </w:p>
@@ -12063,98 +12602,10 @@
                 <w:numId w:val="2"/>
               </w:numPr>
               <w:rPr>
-                <w:color w:val="000000"/>
-              </w:rPr>
-            </w:pPr>
-            <w:r>
-              <w:rPr>
-                <w:color w:val="000000"/>
-              </w:rPr>
-              <w:t>Se abre un modal de confirmación y</w:t>
-            </w:r>
-          </w:p>
-          <w:p>
-            <w:pPr>
-              <w:pStyle w:val="TableContents"/>
-              <w:numPr>
-                <w:ilvl w:val="0"/>
-                <w:numId w:val="2"/>
-              </w:numPr>
-              <w:rPr>
-                <w:color w:val="000000"/>
-              </w:rPr>
-            </w:pPr>
-            <w:r>
-              <w:rPr>
-                <w:color w:val="000000"/>
-              </w:rPr>
-              <w:t>Se abre un modal de más detalle de la solicitud de compra</w:t>
-            </w:r>
-          </w:p>
-          <w:p>
-            <w:pPr>
-              <w:pStyle w:val="TableContents"/>
-              <w:numPr>
-                <w:ilvl w:val="0"/>
-                <w:numId w:val="2"/>
-              </w:numPr>
-              <w:rPr>
-                <w:color w:val="000000"/>
-              </w:rPr>
-            </w:pPr>
-            <w:r>
-              <w:rPr>
-                <w:color w:val="000000"/>
-              </w:rPr>
-              <w:t>Aparece nuevamente el botón “Aprobar” habilitado</w:t>
-            </w:r>
-          </w:p>
-          <w:p>
-            <w:pPr>
-              <w:pStyle w:val="TableContents"/>
-              <w:numPr>
-                <w:ilvl w:val="0"/>
-                <w:numId w:val="2"/>
-              </w:numPr>
-              <w:rPr>
-                <w:color w:val="000000"/>
-                <w:lang w:val="es-PE"/>
-              </w:rPr>
-            </w:pPr>
-            <w:r>
-              <w:rPr>
-                <w:color w:val="000000"/>
-                <w:lang w:val="es-PE"/>
-              </w:rPr>
-              <w:t xml:space="preserve">Al presionarlo muestra un mensaje de </w:t>
-            </w:r>
-            <w:r>
-              <w:rPr>
-                <w:color w:val="000000"/>
-                <w:lang w:val="es-PE"/>
-              </w:rPr>
-              <w:t>confirmación</w:t>
-            </w:r>
-          </w:p>
-          <w:p>
-            <w:pPr>
-              <w:pStyle w:val="TableContents"/>
-              <w:numPr>
-                <w:ilvl w:val="0"/>
-                <w:numId w:val="2"/>
-              </w:numPr>
-              <w:rPr>
-                <w:b/>
-                <w:bCs/>
-              </w:rPr>
-            </w:pPr>
-            <w:r>
-              <w:rPr>
-                <w:color w:val="000000"/>
-                <w:lang w:val="es-PE"/>
-              </w:rPr>
-              <w:t>Se cierra el modal y se actualiza la tabla</w:t>
-            </w:r>
+                <w:b/>
+                <w:bCs/>
+              </w:rPr>
+            </w:pPr>
           </w:p>
         </w:tc>
       </w:tr>
@@ -12429,36 +12880,47 @@
                 <w:ilvl w:val="0"/>
                 <w:numId w:val="2"/>
               </w:numPr>
-            </w:pPr>
-            <w:r>
+              <w:rPr>
+                <w:color w:val="000000"/>
+              </w:rPr>
+            </w:pPr>
+            <w:r>
+              <w:rPr>
+                <w:color w:val="000000"/>
+              </w:rPr>
               <w:t>Tener una cuenta activa</w:t>
             </w:r>
-            <w:r>
-              <w:t xml:space="preserve"> (Estar logueado</w:t>
-            </w:r>
-            <w:r>
-              <w:t xml:space="preserve"> como vendedor</w:t>
-            </w:r>
-            <w:r>
-              <w:t>)</w:t>
-            </w:r>
-          </w:p>
-          <w:p>
-            <w:pPr>
-              <w:pStyle w:val="TableContents"/>
-              <w:numPr>
-                <w:ilvl w:val="0"/>
-                <w:numId w:val="2"/>
-              </w:numPr>
-              <w:rPr>
-                <w:color w:val="000000"/>
-              </w:rPr>
-            </w:pPr>
-            <w:r>
-              <w:rPr>
-                <w:color w:val="000000"/>
-              </w:rPr>
-              <w:t>Tener publicaciones activas</w:t>
+          </w:p>
+          <w:p>
+            <w:pPr>
+              <w:pStyle w:val="TableContents"/>
+              <w:numPr>
+                <w:ilvl w:val="0"/>
+                <w:numId w:val="2"/>
+              </w:numPr>
+              <w:rPr>
+                <w:color w:val="000000"/>
+              </w:rPr>
+            </w:pPr>
+            <w:r>
+              <w:rPr>
+                <w:color w:val="000000"/>
+              </w:rPr>
+              <w:t xml:space="preserve">Encontrase </w:t>
+            </w:r>
+            <w:proofErr w:type="spellStart"/>
+            <w:r>
+              <w:rPr>
+                <w:color w:val="000000"/>
+              </w:rPr>
+              <w:t>logueado</w:t>
+            </w:r>
+            <w:proofErr w:type="spellEnd"/>
+            <w:r>
+              <w:rPr>
+                <w:color w:val="000000"/>
+              </w:rPr>
+              <w:t xml:space="preserve"> como Empresa</w:t>
             </w:r>
           </w:p>
           <w:p>
@@ -12477,6 +12939,42 @@
                 <w:color w:val="000000"/>
               </w:rPr>
               <w:t>Tener solicitudes de compra pendientes</w:t>
+            </w:r>
+          </w:p>
+          <w:p>
+            <w:pPr>
+              <w:pStyle w:val="TableContents"/>
+              <w:numPr>
+                <w:ilvl w:val="0"/>
+                <w:numId w:val="2"/>
+              </w:numPr>
+              <w:rPr>
+                <w:color w:val="000000"/>
+              </w:rPr>
+            </w:pPr>
+            <w:r>
+              <w:rPr>
+                <w:color w:val="000000"/>
+              </w:rPr>
+              <w:t>Estar en la interfaz “Solicitudes”</w:t>
+            </w:r>
+          </w:p>
+          <w:p>
+            <w:pPr>
+              <w:pStyle w:val="TableContents"/>
+              <w:numPr>
+                <w:ilvl w:val="0"/>
+                <w:numId w:val="2"/>
+              </w:numPr>
+              <w:rPr>
+                <w:color w:val="000000"/>
+              </w:rPr>
+            </w:pPr>
+            <w:r>
+              <w:rPr>
+                <w:color w:val="000000"/>
+              </w:rPr>
+              <w:t>Seleccionar una solicitud &gt; Confirmar Solicitud (Forma 1)</w:t>
             </w:r>
           </w:p>
         </w:tc>
@@ -12553,7 +13051,6 @@
               <w:rPr>
                 <w:color w:val="000000"/>
               </w:rPr>
-              <w:lastRenderedPageBreak/>
               <w:t>Abrir el modal de acción de los items de la tabla</w:t>
             </w:r>
           </w:p>
@@ -12627,13 +13124,7 @@
               <w:rPr>
                 <w:color w:val="000000"/>
               </w:rPr>
-              <w:t>Se abre un modal de confirmación</w:t>
-            </w:r>
-            <w:r>
-              <w:rPr>
-                <w:color w:val="000000"/>
-              </w:rPr>
-              <w:t xml:space="preserve"> “Aprobar”</w:t>
+              <w:t>Se abre un modal de confirmación “Aprobar”</w:t>
             </w:r>
           </w:p>
           <w:p>
@@ -12717,52 +13208,10 @@
                 <w:numId w:val="2"/>
               </w:numPr>
               <w:rPr>
-                <w:color w:val="000000"/>
-              </w:rPr>
-            </w:pPr>
-            <w:r>
-              <w:rPr>
-                <w:color w:val="000000"/>
-              </w:rPr>
-              <w:t>Se abre un modal de confirmación “Aprobar”</w:t>
-            </w:r>
-          </w:p>
-          <w:p>
-            <w:pPr>
-              <w:pStyle w:val="TableContents"/>
-              <w:numPr>
-                <w:ilvl w:val="0"/>
-                <w:numId w:val="2"/>
-              </w:numPr>
-              <w:rPr>
-                <w:color w:val="000000"/>
-              </w:rPr>
-            </w:pPr>
-            <w:r>
-              <w:rPr>
-                <w:color w:val="000000"/>
-              </w:rPr>
-              <w:t>Al presionar “SI” se muestra un mensaje “Se aprobó con éxito”</w:t>
-            </w:r>
-          </w:p>
-          <w:p>
-            <w:pPr>
-              <w:pStyle w:val="TableContents"/>
-              <w:numPr>
-                <w:ilvl w:val="0"/>
-                <w:numId w:val="2"/>
-              </w:numPr>
-              <w:rPr>
-                <w:b/>
-                <w:bCs/>
-              </w:rPr>
-            </w:pPr>
-            <w:r>
-              <w:rPr>
-                <w:color w:val="000000"/>
-              </w:rPr>
-              <w:t>Se cierra el modal y se actualiza la tabla</w:t>
-            </w:r>
+                <w:b/>
+                <w:bCs/>
+              </w:rPr>
+            </w:pPr>
           </w:p>
         </w:tc>
       </w:tr>
@@ -13015,36 +13464,47 @@
                 <w:ilvl w:val="0"/>
                 <w:numId w:val="2"/>
               </w:numPr>
-            </w:pPr>
-            <w:r>
+              <w:rPr>
+                <w:color w:val="000000"/>
+              </w:rPr>
+            </w:pPr>
+            <w:r>
+              <w:rPr>
+                <w:color w:val="000000"/>
+              </w:rPr>
               <w:t>Tener una cuenta activa</w:t>
             </w:r>
-            <w:r>
-              <w:t xml:space="preserve"> (Estar logueado</w:t>
-            </w:r>
-            <w:r>
-              <w:t xml:space="preserve"> como vendedor</w:t>
-            </w:r>
-            <w:r>
-              <w:t>)</w:t>
-            </w:r>
-          </w:p>
-          <w:p>
-            <w:pPr>
-              <w:pStyle w:val="TableContents"/>
-              <w:numPr>
-                <w:ilvl w:val="0"/>
-                <w:numId w:val="2"/>
-              </w:numPr>
-              <w:rPr>
-                <w:color w:val="000000"/>
-              </w:rPr>
-            </w:pPr>
-            <w:r>
-              <w:rPr>
-                <w:color w:val="000000"/>
-              </w:rPr>
-              <w:t>Tener publicaciones activas</w:t>
+          </w:p>
+          <w:p>
+            <w:pPr>
+              <w:pStyle w:val="TableContents"/>
+              <w:numPr>
+                <w:ilvl w:val="0"/>
+                <w:numId w:val="2"/>
+              </w:numPr>
+              <w:rPr>
+                <w:color w:val="000000"/>
+              </w:rPr>
+            </w:pPr>
+            <w:r>
+              <w:rPr>
+                <w:color w:val="000000"/>
+              </w:rPr>
+              <w:t xml:space="preserve">Encontrase </w:t>
+            </w:r>
+            <w:proofErr w:type="spellStart"/>
+            <w:r>
+              <w:rPr>
+                <w:color w:val="000000"/>
+              </w:rPr>
+              <w:t>logueado</w:t>
+            </w:r>
+            <w:proofErr w:type="spellEnd"/>
+            <w:r>
+              <w:rPr>
+                <w:color w:val="000000"/>
+              </w:rPr>
+              <w:t xml:space="preserve"> como Empresa</w:t>
             </w:r>
           </w:p>
           <w:p>
@@ -13063,6 +13523,78 @@
                 <w:color w:val="000000"/>
               </w:rPr>
               <w:t>Tener solicitudes de compra pendientes</w:t>
+            </w:r>
+          </w:p>
+          <w:p>
+            <w:pPr>
+              <w:pStyle w:val="TableContents"/>
+              <w:numPr>
+                <w:ilvl w:val="0"/>
+                <w:numId w:val="2"/>
+              </w:numPr>
+              <w:rPr>
+                <w:color w:val="000000"/>
+              </w:rPr>
+            </w:pPr>
+            <w:r>
+              <w:rPr>
+                <w:color w:val="000000"/>
+              </w:rPr>
+              <w:t>Estar en la interfaz “Solicitudes”</w:t>
+            </w:r>
+          </w:p>
+          <w:p>
+            <w:pPr>
+              <w:pStyle w:val="TableContents"/>
+              <w:numPr>
+                <w:ilvl w:val="0"/>
+                <w:numId w:val="2"/>
+              </w:numPr>
+              <w:rPr>
+                <w:color w:val="000000"/>
+              </w:rPr>
+            </w:pPr>
+            <w:r>
+              <w:rPr>
+                <w:color w:val="000000"/>
+              </w:rPr>
+              <w:t>Seleccionar una solicitud &gt; Rechazar Solicitud (Forma 1)</w:t>
+            </w:r>
+          </w:p>
+          <w:p>
+            <w:pPr>
+              <w:pStyle w:val="TableContents"/>
+              <w:numPr>
+                <w:ilvl w:val="0"/>
+                <w:numId w:val="2"/>
+              </w:numPr>
+              <w:rPr>
+                <w:color w:val="000000"/>
+              </w:rPr>
+            </w:pPr>
+            <w:r>
+              <w:rPr>
+                <w:color w:val="000000"/>
+              </w:rPr>
+              <w:t>Seleccionar una solicitud &gt; Detalle solicitud (Forma 2)</w:t>
+            </w:r>
+          </w:p>
+          <w:p>
+            <w:pPr>
+              <w:pStyle w:val="TableContents"/>
+              <w:numPr>
+                <w:ilvl w:val="0"/>
+                <w:numId w:val="2"/>
+              </w:numPr>
+              <w:rPr>
+                <w:color w:val="000000"/>
+              </w:rPr>
+            </w:pPr>
+            <w:r>
+              <w:rPr>
+                <w:color w:val="000000"/>
+              </w:rPr>
+              <w:t>Encontrarse en el la interfaz “Detalle solicitud” (Forma 2)</w:t>
             </w:r>
           </w:p>
         </w:tc>
@@ -13158,19 +13690,26 @@
               <w:rPr>
                 <w:color w:val="000000"/>
               </w:rPr>
-              <w:t>Hacer Click en “</w:t>
-            </w:r>
-            <w:r>
-              <w:rPr>
-                <w:color w:val="000000"/>
-              </w:rPr>
-              <w:t>Rechazar</w:t>
-            </w:r>
-            <w:r>
-              <w:rPr>
-                <w:color w:val="000000"/>
-              </w:rPr>
-              <w:t xml:space="preserve">” </w:t>
+              <w:t xml:space="preserve">Hacer Click en “Rechazar” </w:t>
+            </w:r>
+          </w:p>
+          <w:p>
+            <w:pPr>
+              <w:pStyle w:val="TableContents"/>
+              <w:numPr>
+                <w:ilvl w:val="0"/>
+                <w:numId w:val="2"/>
+              </w:numPr>
+              <w:rPr>
+                <w:b/>
+                <w:bCs/>
+              </w:rPr>
+            </w:pPr>
+            <w:r>
+              <w:rPr>
+                <w:color w:val="000000"/>
+              </w:rPr>
+              <w:t>Hacer Click en “SI” a la advertencia del modal</w:t>
             </w:r>
           </w:p>
         </w:tc>
@@ -13224,49 +13763,25 @@
               <w:rPr>
                 <w:color w:val="000000"/>
               </w:rPr>
-              <w:t>Se abre un modal de confirmación “</w:t>
-            </w:r>
-            <w:r>
-              <w:rPr>
-                <w:color w:val="000000"/>
-              </w:rPr>
-              <w:t>Rechazar</w:t>
-            </w:r>
-            <w:r>
-              <w:rPr>
-                <w:color w:val="000000"/>
-              </w:rPr>
-              <w:t>”</w:t>
-            </w:r>
-          </w:p>
-          <w:p>
-            <w:pPr>
-              <w:pStyle w:val="TableContents"/>
-              <w:numPr>
-                <w:ilvl w:val="0"/>
-                <w:numId w:val="2"/>
-              </w:numPr>
-              <w:rPr>
-                <w:color w:val="000000"/>
-              </w:rPr>
-            </w:pPr>
-            <w:r>
-              <w:rPr>
-                <w:color w:val="000000"/>
-              </w:rPr>
-              <w:t xml:space="preserve">Al presionar “SI” se muestra un mensaje “Se </w:t>
-            </w:r>
-            <w:r>
-              <w:rPr>
-                <w:color w:val="000000"/>
-              </w:rPr>
-              <w:t xml:space="preserve">rechazo </w:t>
-            </w:r>
-            <w:r>
-              <w:rPr>
-                <w:color w:val="000000"/>
-              </w:rPr>
-              <w:t>con éxito”</w:t>
+              <w:t>Se abre un modal de confirmación “Rechazar”</w:t>
+            </w:r>
+          </w:p>
+          <w:p>
+            <w:pPr>
+              <w:pStyle w:val="TableContents"/>
+              <w:numPr>
+                <w:ilvl w:val="0"/>
+                <w:numId w:val="2"/>
+              </w:numPr>
+              <w:rPr>
+                <w:color w:val="000000"/>
+              </w:rPr>
+            </w:pPr>
+            <w:r>
+              <w:rPr>
+                <w:color w:val="000000"/>
+              </w:rPr>
+              <w:t>Al presionar “SI” se muestra un mensaje “Se rechazo con éxito”</w:t>
             </w:r>
           </w:p>
           <w:p>
@@ -13332,76 +13847,10 @@
                 <w:numId w:val="2"/>
               </w:numPr>
               <w:rPr>
-                <w:color w:val="000000"/>
-              </w:rPr>
-            </w:pPr>
-            <w:r>
-              <w:rPr>
-                <w:color w:val="000000"/>
-              </w:rPr>
-              <w:t>Se abre un modal de confirmación “</w:t>
-            </w:r>
-            <w:r>
-              <w:rPr>
-                <w:color w:val="000000"/>
-              </w:rPr>
-              <w:t>Rechazo</w:t>
-            </w:r>
-            <w:r>
-              <w:rPr>
-                <w:color w:val="000000"/>
-              </w:rPr>
-              <w:t>”</w:t>
-            </w:r>
-          </w:p>
-          <w:p>
-            <w:pPr>
-              <w:pStyle w:val="TableContents"/>
-              <w:numPr>
-                <w:ilvl w:val="0"/>
-                <w:numId w:val="2"/>
-              </w:numPr>
-              <w:rPr>
-                <w:color w:val="000000"/>
-              </w:rPr>
-            </w:pPr>
-            <w:r>
-              <w:rPr>
-                <w:color w:val="000000"/>
-              </w:rPr>
-              <w:t xml:space="preserve">Al presionar “SI” se muestra un mensaje “Se </w:t>
-            </w:r>
-            <w:r>
-              <w:rPr>
-                <w:color w:val="000000"/>
-              </w:rPr>
-              <w:t>Rechazo</w:t>
-            </w:r>
-            <w:r>
-              <w:rPr>
-                <w:color w:val="000000"/>
-              </w:rPr>
-              <w:t xml:space="preserve"> con éxito”</w:t>
-            </w:r>
-          </w:p>
-          <w:p>
-            <w:pPr>
-              <w:pStyle w:val="TableContents"/>
-              <w:numPr>
-                <w:ilvl w:val="0"/>
-                <w:numId w:val="2"/>
-              </w:numPr>
-              <w:rPr>
-                <w:b/>
-                <w:bCs/>
-              </w:rPr>
-            </w:pPr>
-            <w:r>
-              <w:rPr>
-                <w:color w:val="000000"/>
-              </w:rPr>
-              <w:t>Se cierra el modal y se actualiza la tabla</w:t>
-            </w:r>
+                <w:b/>
+                <w:bCs/>
+              </w:rPr>
+            </w:pPr>
           </w:p>
         </w:tc>
       </w:tr>
@@ -13554,6 +14003,7 @@
                 <w:b/>
                 <w:bCs/>
               </w:rPr>
+              <w:lastRenderedPageBreak/>
               <w:t>Historia Relacionada N00</w:t>
             </w:r>
             <w:r>
@@ -13651,30 +14101,47 @@
                 <w:ilvl w:val="0"/>
                 <w:numId w:val="2"/>
               </w:numPr>
-            </w:pPr>
-            <w:r>
+              <w:rPr>
+                <w:color w:val="000000"/>
+              </w:rPr>
+            </w:pPr>
+            <w:r>
+              <w:rPr>
+                <w:color w:val="000000"/>
+              </w:rPr>
               <w:t>Tener una cuenta activa</w:t>
             </w:r>
-            <w:r>
-              <w:t xml:space="preserve"> (Estar logueado como vendedor)</w:t>
-            </w:r>
-          </w:p>
-          <w:p>
-            <w:pPr>
-              <w:pStyle w:val="TableContents"/>
-              <w:numPr>
-                <w:ilvl w:val="0"/>
-                <w:numId w:val="2"/>
-              </w:numPr>
-              <w:rPr>
-                <w:color w:val="000000"/>
-              </w:rPr>
-            </w:pPr>
-            <w:r>
-              <w:rPr>
-                <w:color w:val="000000"/>
-              </w:rPr>
-              <w:t>Tener publicaciones activas</w:t>
+          </w:p>
+          <w:p>
+            <w:pPr>
+              <w:pStyle w:val="TableContents"/>
+              <w:numPr>
+                <w:ilvl w:val="0"/>
+                <w:numId w:val="2"/>
+              </w:numPr>
+              <w:rPr>
+                <w:color w:val="000000"/>
+              </w:rPr>
+            </w:pPr>
+            <w:r>
+              <w:rPr>
+                <w:color w:val="000000"/>
+              </w:rPr>
+              <w:t xml:space="preserve">Encontrase </w:t>
+            </w:r>
+            <w:proofErr w:type="spellStart"/>
+            <w:r>
+              <w:rPr>
+                <w:color w:val="000000"/>
+              </w:rPr>
+              <w:t>logueado</w:t>
+            </w:r>
+            <w:proofErr w:type="spellEnd"/>
+            <w:r>
+              <w:rPr>
+                <w:color w:val="000000"/>
+              </w:rPr>
+              <w:t xml:space="preserve"> como Empresa</w:t>
             </w:r>
           </w:p>
           <w:p>
@@ -13693,6 +14160,24 @@
                 <w:color w:val="000000"/>
               </w:rPr>
               <w:t>Tener solicitudes de compra pendientes</w:t>
+            </w:r>
+          </w:p>
+          <w:p>
+            <w:pPr>
+              <w:pStyle w:val="TableContents"/>
+              <w:numPr>
+                <w:ilvl w:val="0"/>
+                <w:numId w:val="2"/>
+              </w:numPr>
+              <w:rPr>
+                <w:color w:val="000000"/>
+              </w:rPr>
+            </w:pPr>
+            <w:r>
+              <w:rPr>
+                <w:color w:val="000000"/>
+              </w:rPr>
+              <w:t>Estar en la interfaz “Solicitudes”</w:t>
             </w:r>
           </w:p>
         </w:tc>
@@ -13870,34 +14355,10 @@
                 <w:numId w:val="2"/>
               </w:numPr>
               <w:rPr>
-                <w:color w:val="000000"/>
-              </w:rPr>
-            </w:pPr>
-            <w:r>
-              <w:rPr>
-                <w:color w:val="000000"/>
-              </w:rPr>
-              <w:t>Se muestra la página de Solicitudes</w:t>
-            </w:r>
-          </w:p>
-          <w:p>
-            <w:pPr>
-              <w:pStyle w:val="TableContents"/>
-              <w:numPr>
-                <w:ilvl w:val="0"/>
-                <w:numId w:val="2"/>
-              </w:numPr>
-              <w:rPr>
-                <w:b/>
-                <w:bCs/>
-              </w:rPr>
-            </w:pPr>
-            <w:r>
-              <w:rPr>
-                <w:color w:val="000000"/>
-              </w:rPr>
-              <w:t>Se visualizan las solicitudes de compra pendientes</w:t>
-            </w:r>
+                <w:b/>
+                <w:bCs/>
+              </w:rPr>
+            </w:pPr>
           </w:p>
         </w:tc>
       </w:tr>
@@ -14159,30 +14620,83 @@
                 <w:ilvl w:val="0"/>
                 <w:numId w:val="2"/>
               </w:numPr>
-            </w:pPr>
-            <w:r>
+              <w:rPr>
+                <w:color w:val="000000"/>
+              </w:rPr>
+            </w:pPr>
+            <w:r>
+              <w:rPr>
+                <w:color w:val="000000"/>
+              </w:rPr>
               <w:t>Tener una cuenta activa</w:t>
             </w:r>
-            <w:r>
-              <w:t xml:space="preserve"> (Estar logueado como vendedor)</w:t>
-            </w:r>
-          </w:p>
-          <w:p>
-            <w:pPr>
-              <w:pStyle w:val="TableContents"/>
-              <w:numPr>
-                <w:ilvl w:val="0"/>
-                <w:numId w:val="2"/>
-              </w:numPr>
-              <w:rPr>
-                <w:color w:val="000000"/>
-              </w:rPr>
-            </w:pPr>
-            <w:r>
-              <w:rPr>
-                <w:color w:val="000000"/>
-              </w:rPr>
-              <w:t>Tener publicaciones activas</w:t>
+          </w:p>
+          <w:p>
+            <w:pPr>
+              <w:pStyle w:val="TableContents"/>
+              <w:numPr>
+                <w:ilvl w:val="0"/>
+                <w:numId w:val="2"/>
+              </w:numPr>
+              <w:rPr>
+                <w:color w:val="000000"/>
+              </w:rPr>
+            </w:pPr>
+            <w:r>
+              <w:rPr>
+                <w:color w:val="000000"/>
+              </w:rPr>
+              <w:t xml:space="preserve">Encontrase </w:t>
+            </w:r>
+            <w:proofErr w:type="spellStart"/>
+            <w:r>
+              <w:rPr>
+                <w:color w:val="000000"/>
+              </w:rPr>
+              <w:t>logueado</w:t>
+            </w:r>
+            <w:proofErr w:type="spellEnd"/>
+            <w:r>
+              <w:rPr>
+                <w:color w:val="000000"/>
+              </w:rPr>
+              <w:t xml:space="preserve"> como Empresa</w:t>
+            </w:r>
+          </w:p>
+          <w:p>
+            <w:pPr>
+              <w:pStyle w:val="TableContents"/>
+              <w:numPr>
+                <w:ilvl w:val="0"/>
+                <w:numId w:val="2"/>
+              </w:numPr>
+              <w:rPr>
+                <w:color w:val="000000"/>
+              </w:rPr>
+            </w:pPr>
+            <w:r>
+              <w:rPr>
+                <w:color w:val="000000"/>
+              </w:rPr>
+              <w:t>No tener solicitudes de compra pendientes</w:t>
+            </w:r>
+          </w:p>
+          <w:p>
+            <w:pPr>
+              <w:pStyle w:val="TableContents"/>
+              <w:numPr>
+                <w:ilvl w:val="0"/>
+                <w:numId w:val="2"/>
+              </w:numPr>
+              <w:rPr>
+                <w:color w:val="000000"/>
+              </w:rPr>
+            </w:pPr>
+            <w:r>
+              <w:rPr>
+                <w:color w:val="000000"/>
+              </w:rPr>
+              <w:t>Estar en la interfaz “Solicitudes”</w:t>
             </w:r>
           </w:p>
         </w:tc>
@@ -14312,13 +14826,7 @@
               <w:rPr>
                 <w:color w:val="000000"/>
               </w:rPr>
-              <w:t xml:space="preserve">Se visualizan </w:t>
-            </w:r>
-            <w:r>
-              <w:rPr>
-                <w:color w:val="000000"/>
-              </w:rPr>
-              <w:t>un mensaje “No hay datos disponibles”</w:t>
+              <w:t>Se visualizan un mensaje “No hay datos disponibles”</w:t>
             </w:r>
           </w:p>
         </w:tc>
@@ -14366,34 +14874,10 @@
                 <w:numId w:val="2"/>
               </w:numPr>
               <w:rPr>
-                <w:color w:val="000000"/>
-              </w:rPr>
-            </w:pPr>
-            <w:r>
-              <w:rPr>
-                <w:color w:val="000000"/>
-              </w:rPr>
-              <w:t>Se muestra la página de Solicitudes</w:t>
-            </w:r>
-          </w:p>
-          <w:p>
-            <w:pPr>
-              <w:pStyle w:val="TableContents"/>
-              <w:numPr>
-                <w:ilvl w:val="0"/>
-                <w:numId w:val="2"/>
-              </w:numPr>
-              <w:rPr>
-                <w:b/>
-                <w:bCs/>
-              </w:rPr>
-            </w:pPr>
-            <w:r>
-              <w:rPr>
-                <w:color w:val="000000"/>
-              </w:rPr>
-              <w:t>Se visualizan un mensaje “No hay datos disponibles”</w:t>
-            </w:r>
+                <w:b/>
+                <w:bCs/>
+              </w:rPr>
+            </w:pPr>
           </w:p>
         </w:tc>
       </w:tr>
@@ -14629,30 +15113,83 @@
                 <w:ilvl w:val="0"/>
                 <w:numId w:val="2"/>
               </w:numPr>
-            </w:pPr>
-            <w:r>
+              <w:rPr>
+                <w:color w:val="000000"/>
+              </w:rPr>
+            </w:pPr>
+            <w:r>
+              <w:rPr>
+                <w:color w:val="000000"/>
+              </w:rPr>
               <w:t>Tener una cuenta activa</w:t>
             </w:r>
-            <w:r>
-              <w:t xml:space="preserve"> (Estar logueado como comprador)</w:t>
-            </w:r>
-          </w:p>
-          <w:p>
-            <w:pPr>
-              <w:pStyle w:val="TableContents"/>
-              <w:numPr>
-                <w:ilvl w:val="0"/>
-                <w:numId w:val="2"/>
-              </w:numPr>
-              <w:rPr>
-                <w:color w:val="000000"/>
-              </w:rPr>
-            </w:pPr>
-            <w:r>
-              <w:rPr>
-                <w:color w:val="000000"/>
-              </w:rPr>
-              <w:t>Tener publicaciones activas</w:t>
+          </w:p>
+          <w:p>
+            <w:pPr>
+              <w:pStyle w:val="TableContents"/>
+              <w:numPr>
+                <w:ilvl w:val="0"/>
+                <w:numId w:val="2"/>
+              </w:numPr>
+              <w:rPr>
+                <w:color w:val="000000"/>
+              </w:rPr>
+            </w:pPr>
+            <w:r>
+              <w:rPr>
+                <w:color w:val="000000"/>
+              </w:rPr>
+              <w:t xml:space="preserve">Encontrase </w:t>
+            </w:r>
+            <w:proofErr w:type="spellStart"/>
+            <w:r>
+              <w:rPr>
+                <w:color w:val="000000"/>
+              </w:rPr>
+              <w:t>logueado</w:t>
+            </w:r>
+            <w:proofErr w:type="spellEnd"/>
+            <w:r>
+              <w:rPr>
+                <w:color w:val="000000"/>
+              </w:rPr>
+              <w:t xml:space="preserve"> como Persona</w:t>
+            </w:r>
+          </w:p>
+          <w:p>
+            <w:pPr>
+              <w:pStyle w:val="TableContents"/>
+              <w:numPr>
+                <w:ilvl w:val="0"/>
+                <w:numId w:val="2"/>
+              </w:numPr>
+              <w:rPr>
+                <w:color w:val="000000"/>
+              </w:rPr>
+            </w:pPr>
+            <w:r>
+              <w:rPr>
+                <w:color w:val="000000"/>
+              </w:rPr>
+              <w:t>Tener solicitudes de compra aprobadas</w:t>
+            </w:r>
+          </w:p>
+          <w:p>
+            <w:pPr>
+              <w:pStyle w:val="TableContents"/>
+              <w:numPr>
+                <w:ilvl w:val="0"/>
+                <w:numId w:val="2"/>
+              </w:numPr>
+              <w:rPr>
+                <w:color w:val="000000"/>
+              </w:rPr>
+            </w:pPr>
+            <w:r>
+              <w:rPr>
+                <w:color w:val="000000"/>
+              </w:rPr>
+              <w:t>Estar en la interfaz “Solicitudes”</w:t>
             </w:r>
           </w:p>
         </w:tc>
@@ -14830,34 +15367,10 @@
                 <w:numId w:val="2"/>
               </w:numPr>
               <w:rPr>
-                <w:color w:val="000000"/>
-              </w:rPr>
-            </w:pPr>
-            <w:r>
-              <w:rPr>
-                <w:color w:val="000000"/>
-              </w:rPr>
-              <w:t>Se muestra la página de Solicitudes</w:t>
-            </w:r>
-          </w:p>
-          <w:p>
-            <w:pPr>
-              <w:pStyle w:val="TableContents"/>
-              <w:numPr>
-                <w:ilvl w:val="0"/>
-                <w:numId w:val="2"/>
-              </w:numPr>
-              <w:rPr>
-                <w:b/>
-                <w:bCs/>
-              </w:rPr>
-            </w:pPr>
-            <w:r>
-              <w:rPr>
-                <w:color w:val="000000"/>
-              </w:rPr>
-              <w:t>Se visualizan los card de solicitudes de compra pendientes a pagar</w:t>
-            </w:r>
+                <w:b/>
+                <w:bCs/>
+              </w:rPr>
+            </w:pPr>
           </w:p>
         </w:tc>
       </w:tr>
@@ -14935,7 +15448,11 @@
               <w:jc w:val="left"/>
             </w:pPr>
             <w:r>
-              <w:t>Descripción de Caso de Prueba: Flujo de listar mis solicitudes de compra como comprador – Sin datos validos</w:t>
+              <w:t xml:space="preserve">Descripción de Caso de Prueba: Flujo de listar mis solicitudes de compra </w:t>
+            </w:r>
+            <w:r>
+              <w:lastRenderedPageBreak/>
+              <w:t>como comprador – Sin datos validos</w:t>
             </w:r>
           </w:p>
         </w:tc>
@@ -15093,30 +15610,83 @@
                 <w:ilvl w:val="0"/>
                 <w:numId w:val="2"/>
               </w:numPr>
-            </w:pPr>
-            <w:r>
+              <w:rPr>
+                <w:color w:val="000000"/>
+              </w:rPr>
+            </w:pPr>
+            <w:r>
+              <w:rPr>
+                <w:color w:val="000000"/>
+              </w:rPr>
               <w:t>Tener una cuenta activa</w:t>
             </w:r>
-            <w:r>
-              <w:t xml:space="preserve"> (Estar logueado como comprador)</w:t>
-            </w:r>
-          </w:p>
-          <w:p>
-            <w:pPr>
-              <w:pStyle w:val="TableContents"/>
-              <w:numPr>
-                <w:ilvl w:val="0"/>
-                <w:numId w:val="2"/>
-              </w:numPr>
-              <w:rPr>
-                <w:color w:val="000000"/>
-              </w:rPr>
-            </w:pPr>
-            <w:r>
-              <w:rPr>
-                <w:color w:val="000000"/>
-              </w:rPr>
-              <w:t>Tener publicaciones activas</w:t>
+          </w:p>
+          <w:p>
+            <w:pPr>
+              <w:pStyle w:val="TableContents"/>
+              <w:numPr>
+                <w:ilvl w:val="0"/>
+                <w:numId w:val="2"/>
+              </w:numPr>
+              <w:rPr>
+                <w:color w:val="000000"/>
+              </w:rPr>
+            </w:pPr>
+            <w:r>
+              <w:rPr>
+                <w:color w:val="000000"/>
+              </w:rPr>
+              <w:t xml:space="preserve">Encontrase </w:t>
+            </w:r>
+            <w:proofErr w:type="spellStart"/>
+            <w:r>
+              <w:rPr>
+                <w:color w:val="000000"/>
+              </w:rPr>
+              <w:t>logueado</w:t>
+            </w:r>
+            <w:proofErr w:type="spellEnd"/>
+            <w:r>
+              <w:rPr>
+                <w:color w:val="000000"/>
+              </w:rPr>
+              <w:t xml:space="preserve"> como Persona</w:t>
+            </w:r>
+          </w:p>
+          <w:p>
+            <w:pPr>
+              <w:pStyle w:val="TableContents"/>
+              <w:numPr>
+                <w:ilvl w:val="0"/>
+                <w:numId w:val="2"/>
+              </w:numPr>
+              <w:rPr>
+                <w:color w:val="000000"/>
+              </w:rPr>
+            </w:pPr>
+            <w:r>
+              <w:rPr>
+                <w:color w:val="000000"/>
+              </w:rPr>
+              <w:t>No tener solicitudes de compra aprobadas</w:t>
+            </w:r>
+          </w:p>
+          <w:p>
+            <w:pPr>
+              <w:pStyle w:val="TableContents"/>
+              <w:numPr>
+                <w:ilvl w:val="0"/>
+                <w:numId w:val="2"/>
+              </w:numPr>
+              <w:rPr>
+                <w:color w:val="000000"/>
+              </w:rPr>
+            </w:pPr>
+            <w:r>
+              <w:rPr>
+                <w:color w:val="000000"/>
+              </w:rPr>
+              <w:t>Estar en la interfaz “Solicitudes”</w:t>
             </w:r>
           </w:p>
         </w:tc>
@@ -15294,34 +15864,10 @@
                 <w:numId w:val="2"/>
               </w:numPr>
               <w:rPr>
-                <w:color w:val="000000"/>
-              </w:rPr>
-            </w:pPr>
-            <w:r>
-              <w:rPr>
-                <w:color w:val="000000"/>
-              </w:rPr>
-              <w:t>Se muestra la página de Solicitudes</w:t>
-            </w:r>
-          </w:p>
-          <w:p>
-            <w:pPr>
-              <w:pStyle w:val="TableContents"/>
-              <w:numPr>
-                <w:ilvl w:val="0"/>
-                <w:numId w:val="2"/>
-              </w:numPr>
-              <w:rPr>
-                <w:b/>
-                <w:bCs/>
-              </w:rPr>
-            </w:pPr>
-            <w:r>
-              <w:rPr>
-                <w:color w:val="000000"/>
-              </w:rPr>
-              <w:t>Se visualizan un mensaje “No hay datos disponibles”</w:t>
-            </w:r>
+                <w:b/>
+                <w:bCs/>
+              </w:rPr>
+            </w:pPr>
           </w:p>
         </w:tc>
       </w:tr>
@@ -15569,30 +16115,83 @@
                 <w:ilvl w:val="0"/>
                 <w:numId w:val="2"/>
               </w:numPr>
-            </w:pPr>
-            <w:r>
+              <w:rPr>
+                <w:color w:val="000000"/>
+              </w:rPr>
+            </w:pPr>
+            <w:r>
+              <w:rPr>
+                <w:color w:val="000000"/>
+              </w:rPr>
               <w:t>Tener una cuenta activa</w:t>
             </w:r>
-            <w:r>
-              <w:t xml:space="preserve"> (Estar logueado como comprador)</w:t>
-            </w:r>
-          </w:p>
-          <w:p>
-            <w:pPr>
-              <w:pStyle w:val="TableContents"/>
-              <w:numPr>
-                <w:ilvl w:val="0"/>
-                <w:numId w:val="2"/>
-              </w:numPr>
-              <w:rPr>
-                <w:color w:val="000000"/>
-              </w:rPr>
-            </w:pPr>
-            <w:r>
-              <w:rPr>
-                <w:color w:val="000000"/>
-              </w:rPr>
-              <w:t>Tener publicaciones activas</w:t>
+          </w:p>
+          <w:p>
+            <w:pPr>
+              <w:pStyle w:val="TableContents"/>
+              <w:numPr>
+                <w:ilvl w:val="0"/>
+                <w:numId w:val="2"/>
+              </w:numPr>
+              <w:rPr>
+                <w:color w:val="000000"/>
+              </w:rPr>
+            </w:pPr>
+            <w:r>
+              <w:rPr>
+                <w:color w:val="000000"/>
+              </w:rPr>
+              <w:t xml:space="preserve">Encontrase </w:t>
+            </w:r>
+            <w:proofErr w:type="spellStart"/>
+            <w:r>
+              <w:rPr>
+                <w:color w:val="000000"/>
+              </w:rPr>
+              <w:t>logueado</w:t>
+            </w:r>
+            <w:proofErr w:type="spellEnd"/>
+            <w:r>
+              <w:rPr>
+                <w:color w:val="000000"/>
+              </w:rPr>
+              <w:t xml:space="preserve"> como Persona</w:t>
+            </w:r>
+          </w:p>
+          <w:p>
+            <w:pPr>
+              <w:pStyle w:val="TableContents"/>
+              <w:numPr>
+                <w:ilvl w:val="0"/>
+                <w:numId w:val="2"/>
+              </w:numPr>
+              <w:rPr>
+                <w:color w:val="000000"/>
+              </w:rPr>
+            </w:pPr>
+            <w:r>
+              <w:rPr>
+                <w:color w:val="000000"/>
+              </w:rPr>
+              <w:t>Tener solicitudes de compra aprobadas</w:t>
+            </w:r>
+          </w:p>
+          <w:p>
+            <w:pPr>
+              <w:pStyle w:val="TableContents"/>
+              <w:numPr>
+                <w:ilvl w:val="0"/>
+                <w:numId w:val="2"/>
+              </w:numPr>
+              <w:rPr>
+                <w:color w:val="000000"/>
+              </w:rPr>
+            </w:pPr>
+            <w:r>
+              <w:rPr>
+                <w:color w:val="000000"/>
+              </w:rPr>
+              <w:t>Estar en la interfaz “Solicitudes”</w:t>
             </w:r>
           </w:p>
           <w:p>
@@ -15807,34 +16406,10 @@
                 <w:numId w:val="2"/>
               </w:numPr>
               <w:rPr>
-                <w:color w:val="000000"/>
-              </w:rPr>
-            </w:pPr>
-            <w:r>
-              <w:rPr>
-                <w:color w:val="000000"/>
-              </w:rPr>
-              <w:t>Se muestran las opciones de pago</w:t>
-            </w:r>
-          </w:p>
-          <w:p>
-            <w:pPr>
-              <w:pStyle w:val="TableContents"/>
-              <w:numPr>
-                <w:ilvl w:val="0"/>
-                <w:numId w:val="2"/>
-              </w:numPr>
-              <w:rPr>
-                <w:b/>
-                <w:bCs/>
-              </w:rPr>
-            </w:pPr>
-            <w:r>
-              <w:rPr>
-                <w:color w:val="000000"/>
-              </w:rPr>
-              <w:t>Cada opción tiene breve información visible</w:t>
-            </w:r>
+                <w:b/>
+                <w:bCs/>
+              </w:rPr>
+            </w:pPr>
           </w:p>
         </w:tc>
       </w:tr>
@@ -15853,6 +16428,95 @@
 <file path=word/numbering.xml><?xml version="1.0" encoding="utf-8"?>
 <w:numbering xmlns:wpc="http://schemas.microsoft.com/office/word/2010/wordprocessingCanvas" xmlns:cx="http://schemas.microsoft.com/office/drawing/2014/chartex" xmlns:cx1="http://schemas.microsoft.com/office/drawing/2015/9/8/chartex" xmlns:cx2="http://schemas.microsoft.com/office/drawing/2015/10/21/chartex" xmlns:cx3="http://schemas.microsoft.com/office/drawing/2016/5/9/chartex" xmlns:cx4="http://schemas.microsoft.com/office/drawing/2016/5/10/chartex" xmlns:cx5="http://schemas.microsoft.com/office/drawing/2016/5/11/chartex" xmlns:cx6="http://schemas.microsoft.com/office/drawing/2016/5/12/chartex" xmlns:cx7="http://schemas.microsoft.com/office/drawing/2016/5/13/chartex" xmlns:cx8="http://schemas.microsoft.com/office/drawing/2016/5/14/chartex" xmlns:mc="http://schemas.openxmlformats.org/markup-compatibility/2006" xmlns:aink="http://schemas.microsoft.com/office/drawing/2016/ink" xmlns:am3d="http://schemas.microsoft.com/office/drawing/2017/model3d" xmlns:o="urn:schemas-microsoft-com:office:office" xmlns:oel="http://schemas.microsoft.com/office/2019/extlst" xmlns:r="http://schemas.openxmlformats.org/officeDocument/2006/relationships" xmlns:m="http://schemas.openxmlformats.org/officeDocument/2006/math" xmlns:v="urn:schemas-microsoft-com:vml" xmlns:wp14="http://schemas.microsoft.com/office/word/2010/wordprocessingDrawing" xmlns:wp="http://schemas.openxmlformats.org/drawingml/2006/wordprocessingDrawing" xmlns:w10="urn:schemas-microsoft-com:office:word" xmlns:w="http://schemas.openxmlformats.org/wordprocessingml/2006/main" xmlns:w14="http://schemas.microsoft.com/office/word/2010/wordml" xmlns:w15="http://schemas.microsoft.com/office/word/2012/wordml" xmlns:w16cex="http://schemas.microsoft.com/office/word/2018/wordml/cex" xmlns:w16cid="http://schemas.microsoft.com/office/word/2016/wordml/cid" xmlns:w16="http://schemas.microsoft.com/office/word/2018/wordml" xmlns:w16du="http://schemas.microsoft.com/office/word/2023/wordml/word16du" xmlns:w16sdtdh="http://schemas.microsoft.com/office/word/2020/wordml/sdtdatahash" xmlns:w16sdtfl="http://schemas.microsoft.com/office/word/2024/wordml/sdtformatlock" xmlns:w16se="http://schemas.microsoft.com/office/word/2015/wordml/symex" xmlns:wpg="http://schemas.microsoft.com/office/word/2010/wordprocessingGroup" xmlns:wpi="http://schemas.microsoft.com/office/word/2010/wordprocessingInk" xmlns:wne="http://schemas.microsoft.com/office/word/2006/wordml" xmlns:wps="http://schemas.microsoft.com/office/word/2010/wordprocessingShape" mc:Ignorable="w14 w15 w16se w16cid w16 w16cex w16sdtdh w16sdtfl w16du wp14">
   <w:abstractNum w:abstractNumId="0" w15:restartNumberingAfterBreak="0">
+    <w:nsid w:val="23B6260C"/>
+    <w:multiLevelType w:val="hybridMultilevel"/>
+    <w:tmpl w:val="080CFBAA"/>
+    <w:lvl w:ilvl="0" w:tplc="C98EC05C">
+      <w:start w:val="1"/>
+      <w:numFmt w:val="decimal"/>
+      <w:lvlText w:val="%1."/>
+      <w:lvlJc w:val="left"/>
+      <w:pPr>
+        <w:ind w:left="1" w:hanging="360"/>
+      </w:pPr>
+      <w:rPr>
+        <w:rFonts w:hint="default"/>
+      </w:rPr>
+    </w:lvl>
+    <w:lvl w:ilvl="1" w:tplc="280A0019" w:tentative="1">
+      <w:start w:val="1"/>
+      <w:numFmt w:val="lowerLetter"/>
+      <w:lvlText w:val="%2."/>
+      <w:lvlJc w:val="left"/>
+      <w:pPr>
+        <w:ind w:left="721" w:hanging="360"/>
+      </w:pPr>
+    </w:lvl>
+    <w:lvl w:ilvl="2" w:tplc="280A001B" w:tentative="1">
+      <w:start w:val="1"/>
+      <w:numFmt w:val="lowerRoman"/>
+      <w:lvlText w:val="%3."/>
+      <w:lvlJc w:val="right"/>
+      <w:pPr>
+        <w:ind w:left="1441" w:hanging="180"/>
+      </w:pPr>
+    </w:lvl>
+    <w:lvl w:ilvl="3" w:tplc="280A000F" w:tentative="1">
+      <w:start w:val="1"/>
+      <w:numFmt w:val="decimal"/>
+      <w:lvlText w:val="%4."/>
+      <w:lvlJc w:val="left"/>
+      <w:pPr>
+        <w:ind w:left="2161" w:hanging="360"/>
+      </w:pPr>
+    </w:lvl>
+    <w:lvl w:ilvl="4" w:tplc="280A0019" w:tentative="1">
+      <w:start w:val="1"/>
+      <w:numFmt w:val="lowerLetter"/>
+      <w:lvlText w:val="%5."/>
+      <w:lvlJc w:val="left"/>
+      <w:pPr>
+        <w:ind w:left="2881" w:hanging="360"/>
+      </w:pPr>
+    </w:lvl>
+    <w:lvl w:ilvl="5" w:tplc="280A001B" w:tentative="1">
+      <w:start w:val="1"/>
+      <w:numFmt w:val="lowerRoman"/>
+      <w:lvlText w:val="%6."/>
+      <w:lvlJc w:val="right"/>
+      <w:pPr>
+        <w:ind w:left="3601" w:hanging="180"/>
+      </w:pPr>
+    </w:lvl>
+    <w:lvl w:ilvl="6" w:tplc="280A000F" w:tentative="1">
+      <w:start w:val="1"/>
+      <w:numFmt w:val="decimal"/>
+      <w:lvlText w:val="%7."/>
+      <w:lvlJc w:val="left"/>
+      <w:pPr>
+        <w:ind w:left="4321" w:hanging="360"/>
+      </w:pPr>
+    </w:lvl>
+    <w:lvl w:ilvl="7" w:tplc="280A0019" w:tentative="1">
+      <w:start w:val="1"/>
+      <w:numFmt w:val="lowerLetter"/>
+      <w:lvlText w:val="%8."/>
+      <w:lvlJc w:val="left"/>
+      <w:pPr>
+        <w:ind w:left="5041" w:hanging="360"/>
+      </w:pPr>
+    </w:lvl>
+    <w:lvl w:ilvl="8" w:tplc="280A001B" w:tentative="1">
+      <w:start w:val="1"/>
+      <w:numFmt w:val="lowerRoman"/>
+      <w:lvlText w:val="%9."/>
+      <w:lvlJc w:val="right"/>
+      <w:pPr>
+        <w:ind w:left="5761" w:hanging="180"/>
+      </w:pPr>
+    </w:lvl>
+  </w:abstractNum>
+  <w:abstractNum w:abstractNumId="1" w15:restartNumberingAfterBreak="0">
     <w:nsid w:val="42922F73"/>
     <w:multiLevelType w:val="hybridMultilevel"/>
     <w:tmpl w:val="4B9E853E"/>
@@ -15964,7 +16628,7 @@
       </w:rPr>
     </w:lvl>
   </w:abstractNum>
-  <w:abstractNum w:abstractNumId="1" w15:restartNumberingAfterBreak="0">
+  <w:abstractNum w:abstractNumId="2" w15:restartNumberingAfterBreak="0">
     <w:nsid w:val="63F21947"/>
     <w:multiLevelType w:val="multilevel"/>
     <w:tmpl w:val="F844D12E"/>
@@ -16057,9 +16721,12 @@
     </w:lvl>
   </w:abstractNum>
   <w:num w:numId="1" w16cid:durableId="1781947047">
+    <w:abstractNumId w:val="2"/>
+  </w:num>
+  <w:num w:numId="2" w16cid:durableId="363404011">
     <w:abstractNumId w:val="1"/>
   </w:num>
-  <w:num w:numId="2" w16cid:durableId="363404011">
+  <w:num w:numId="3" w16cid:durableId="884682039">
     <w:abstractNumId w:val="0"/>
   </w:num>
 </w:numbering>

</xml_diff>